<commit_message>
Update DANH_SACH_CONG_CU_MO_HINH_API_NGUON_THAM_KHAO.docx to include all 43 backend RESTful API endpoints across all modules
</commit_message>
<xml_diff>
--- a/DANH_SACH_CONG_CU_MO_HINH_API_NGUON_THAM_KHAO.docx
+++ b/DANH_SACH_CONG_CU_MO_HINH_API_NGUON_THAM_KHAO.docx
@@ -42,9 +42,9 @@
                 <w:rFonts w:ascii="Times New Roman" w:hAnsi="Times New Roman"/>
                 <w:b/>
                 <w:color w:val="FFFFFF"/>
-                <w:sz w:val="32"/>
+                <w:sz w:val="30"/>
               </w:rPr>
-              <w:t>DANH SÁCH CÔNG CỤ, MÔ HÌNH AI, API VÀ NGUỒN THAM KHẢO CHÍNH</w:t>
+              <w:t>DANH SÁCH CÔNG CỤ, MÔ HÌNH AI, TOÀN BỘ APIS VÀ NGUỒN THAM KHẢO CHÍNH</w:t>
               <w:br/>
               <w:t>ENGLISH ADAPTIVE LMS (TRACK A)</w:t>
             </w:r>
@@ -65,7 +65,7 @@
           <w:color w:val="1B4F72"/>
           <w:sz w:val="30"/>
         </w:rPr>
-        <w:t>1. DANH SÁCH CÔNG CỤ PHÁT TRIỂN &amp; CÔNG NGHỆ CỐT LÕI (DEVELOPMENT TOOLS &amp; STACK)</w:t>
+        <w:t>1. DANH SÁCH CÔNG CỤ PHÁT TRIỂN &amp; CÔNG NGHỆ CỐT LÕI (DEVELOPMENT STACK)</w:t>
       </w:r>
     </w:p>
     <w:p>
@@ -568,7 +568,7 @@
           <w:color w:val="1B4F72"/>
           <w:sz w:val="30"/>
         </w:rPr>
-        <w:t>2. MÔ HÌNH TRI TRÍ THỨC VÀ API TÍCH HỢP (AI MODELS &amp; INTEGRATED APIS)</w:t>
+        <w:t>2. MÔ HÌNH TRÍ THỨC AI VÀ ENGINE CHẤM ĐIỂM (AI MODELS &amp; ENGINES)</w:t>
       </w:r>
     </w:p>
     <w:p>
@@ -652,7 +652,3879 @@
           <w:color w:val="1B4F72"/>
           <w:sz w:val="30"/>
         </w:rPr>
-        <w:t>3. DANH SÁCH NGUỒN THAM KHẢO VÀ CHUẨN ĐÁNH GIÁ CHÍNH (MAIN REFERENCES)</w:t>
+        <w:t>3. TOÀN BỘ TÀI LIỆU VÀ DANH SÁCH RESTFUL APIS HỆ THỐNG (COMPLETE API DOCUMENTATION)</w:t>
+      </w:r>
+    </w:p>
+    <w:p>
+      <w:pPr>
+        <w:jc w:val="left"/>
+      </w:pPr>
+      <w:r>
+        <w:t>Hệ thống English Adaptive LMS cung cấp 43 Endpoints RESTful API chuẩn hóa, kết nối bảo mật qua HTTP/HTTPS với Bearer JWT Token và định dạng dữ liệu phản hồi JSON. Dưới đây là bảng dàn ý chi tiết toàn bộ các API theo từng nhóm module backend:</w:t>
+      </w:r>
+    </w:p>
+    <w:tbl>
+      <w:tblPr>
+        <w:tblW w:type="auto" w:w="0"/>
+        <w:jc w:val="center"/>
+        <w:tblLook w:firstColumn="1" w:firstRow="1" w:lastColumn="0" w:lastRow="0" w:noHBand="0" w:noVBand="1" w:val="04A0"/>
+      </w:tblPr>
+      <w:tblGrid>
+        <w:gridCol w:w="2484"/>
+        <w:gridCol w:w="2484"/>
+        <w:gridCol w:w="2484"/>
+        <w:gridCol w:w="2484"/>
+      </w:tblGrid>
+      <w:tr>
+        <w:tc>
+          <w:tcPr>
+            <w:tcW w:type="dxa" w:w="2484"/>
+            <w:shd w:fill="2874A6"/>
+            <w:tcMar>
+              <w:top w:w="100" w:type="dxa"/>
+              <w:bottom w:w="100" w:type="dxa"/>
+              <w:left w:w="100" w:type="dxa"/>
+              <w:right w:w="100" w:type="dxa"/>
+            </w:tcMar>
+          </w:tcPr>
+          <w:p>
+            <w:r>
+              <w:rPr>
+                <w:rFonts w:ascii="Times New Roman" w:hAnsi="Times New Roman"/>
+                <w:b/>
+                <w:color w:val="FFFFFF"/>
+                <w:sz w:val="26"/>
+              </w:rPr>
+              <w:t>Phương Thức</w:t>
+            </w:r>
+          </w:p>
+        </w:tc>
+        <w:tc>
+          <w:tcPr>
+            <w:tcW w:type="dxa" w:w="2484"/>
+            <w:shd w:fill="2874A6"/>
+            <w:tcMar>
+              <w:top w:w="100" w:type="dxa"/>
+              <w:bottom w:w="100" w:type="dxa"/>
+              <w:left w:w="100" w:type="dxa"/>
+              <w:right w:w="100" w:type="dxa"/>
+            </w:tcMar>
+          </w:tcPr>
+          <w:p>
+            <w:r>
+              <w:rPr>
+                <w:rFonts w:ascii="Times New Roman" w:hAnsi="Times New Roman"/>
+                <w:b/>
+                <w:color w:val="FFFFFF"/>
+                <w:sz w:val="26"/>
+              </w:rPr>
+              <w:t>Đường Dẫn Endpoint (URL Path)</w:t>
+            </w:r>
+          </w:p>
+        </w:tc>
+        <w:tc>
+          <w:tcPr>
+            <w:tcW w:type="dxa" w:w="2484"/>
+            <w:shd w:fill="2874A6"/>
+            <w:tcMar>
+              <w:top w:w="100" w:type="dxa"/>
+              <w:bottom w:w="100" w:type="dxa"/>
+              <w:left w:w="100" w:type="dxa"/>
+              <w:right w:w="100" w:type="dxa"/>
+            </w:tcMar>
+          </w:tcPr>
+          <w:p>
+            <w:r>
+              <w:rPr>
+                <w:rFonts w:ascii="Times New Roman" w:hAnsi="Times New Roman"/>
+                <w:b/>
+                <w:color w:val="FFFFFF"/>
+                <w:sz w:val="26"/>
+              </w:rPr>
+              <w:t>Quyền Truy Cấp</w:t>
+            </w:r>
+          </w:p>
+        </w:tc>
+        <w:tc>
+          <w:tcPr>
+            <w:tcW w:type="dxa" w:w="2484"/>
+            <w:shd w:fill="2874A6"/>
+            <w:tcMar>
+              <w:top w:w="100" w:type="dxa"/>
+              <w:bottom w:w="100" w:type="dxa"/>
+              <w:left w:w="100" w:type="dxa"/>
+              <w:right w:w="100" w:type="dxa"/>
+            </w:tcMar>
+          </w:tcPr>
+          <w:p>
+            <w:r>
+              <w:rPr>
+                <w:rFonts w:ascii="Times New Roman" w:hAnsi="Times New Roman"/>
+                <w:b/>
+                <w:color w:val="FFFFFF"/>
+                <w:sz w:val="26"/>
+              </w:rPr>
+              <w:t>Mô Tả Chức Năng &amp; Phân Loại</w:t>
+            </w:r>
+          </w:p>
+        </w:tc>
+      </w:tr>
+      <w:tr>
+        <w:tc>
+          <w:tcPr>
+            <w:tcW w:type="dxa" w:w="1584"/>
+            <w:shd w:fill="F4F6F7"/>
+            <w:tcMar>
+              <w:top w:w="60" w:type="dxa"/>
+              <w:bottom w:w="60" w:type="dxa"/>
+              <w:left w:w="60" w:type="dxa"/>
+              <w:right w:w="60" w:type="dxa"/>
+            </w:tcMar>
+          </w:tcPr>
+          <w:p>
+            <w:r>
+              <w:rPr>
+                <w:rFonts w:ascii="Times New Roman" w:hAnsi="Times New Roman"/>
+                <w:b/>
+                <w:sz w:val="26"/>
+              </w:rPr>
+              <w:t>POST</w:t>
+            </w:r>
+          </w:p>
+        </w:tc>
+        <w:tc>
+          <w:tcPr>
+            <w:tcW w:type="dxa" w:w="3600"/>
+            <w:shd w:fill="F4F6F7"/>
+            <w:tcMar>
+              <w:top w:w="60" w:type="dxa"/>
+              <w:bottom w:w="60" w:type="dxa"/>
+              <w:left w:w="60" w:type="dxa"/>
+              <w:right w:w="60" w:type="dxa"/>
+            </w:tcMar>
+          </w:tcPr>
+          <w:p>
+            <w:r>
+              <w:rPr>
+                <w:rFonts w:ascii="Times New Roman" w:hAnsi="Times New Roman"/>
+                <w:sz w:val="26"/>
+              </w:rPr>
+              <w:t>/api/auth/register</w:t>
+            </w:r>
+          </w:p>
+        </w:tc>
+        <w:tc>
+          <w:tcPr>
+            <w:tcW w:type="dxa" w:w="1728"/>
+            <w:shd w:fill="F4F6F7"/>
+            <w:tcMar>
+              <w:top w:w="60" w:type="dxa"/>
+              <w:bottom w:w="60" w:type="dxa"/>
+              <w:left w:w="60" w:type="dxa"/>
+              <w:right w:w="60" w:type="dxa"/>
+            </w:tcMar>
+          </w:tcPr>
+          <w:p>
+            <w:r>
+              <w:rPr>
+                <w:rFonts w:ascii="Times New Roman" w:hAnsi="Times New Roman"/>
+                <w:sz w:val="26"/>
+              </w:rPr>
+              <w:t>Public</w:t>
+            </w:r>
+          </w:p>
+        </w:tc>
+        <w:tc>
+          <w:tcPr>
+            <w:tcW w:type="dxa" w:w="2880"/>
+            <w:shd w:fill="F4F6F7"/>
+            <w:tcMar>
+              <w:top w:w="60" w:type="dxa"/>
+              <w:bottom w:w="60" w:type="dxa"/>
+              <w:left w:w="60" w:type="dxa"/>
+              <w:right w:w="60" w:type="dxa"/>
+            </w:tcMar>
+          </w:tcPr>
+          <w:p>
+            <w:r>
+              <w:rPr>
+                <w:rFonts w:ascii="Times New Roman" w:hAnsi="Times New Roman"/>
+                <w:sz w:val="26"/>
+              </w:rPr>
+              <w:t>Đăng ký tài khoản Học viên mới (Mặc định: support)</w:t>
+            </w:r>
+          </w:p>
+        </w:tc>
+      </w:tr>
+      <w:tr>
+        <w:tc>
+          <w:tcPr>
+            <w:tcW w:type="dxa" w:w="1584"/>
+            <w:shd w:fill="F9EBEA"/>
+            <w:tcMar>
+              <w:top w:w="60" w:type="dxa"/>
+              <w:bottom w:w="60" w:type="dxa"/>
+              <w:left w:w="60" w:type="dxa"/>
+              <w:right w:w="60" w:type="dxa"/>
+            </w:tcMar>
+          </w:tcPr>
+          <w:p>
+            <w:r>
+              <w:rPr>
+                <w:rFonts w:ascii="Times New Roman" w:hAnsi="Times New Roman"/>
+                <w:b/>
+                <w:sz w:val="26"/>
+              </w:rPr>
+              <w:t>POST</w:t>
+            </w:r>
+          </w:p>
+        </w:tc>
+        <w:tc>
+          <w:tcPr>
+            <w:tcW w:type="dxa" w:w="3600"/>
+            <w:shd w:fill="F9EBEA"/>
+            <w:tcMar>
+              <w:top w:w="60" w:type="dxa"/>
+              <w:bottom w:w="60" w:type="dxa"/>
+              <w:left w:w="60" w:type="dxa"/>
+              <w:right w:w="60" w:type="dxa"/>
+            </w:tcMar>
+          </w:tcPr>
+          <w:p>
+            <w:r>
+              <w:rPr>
+                <w:rFonts w:ascii="Times New Roman" w:hAnsi="Times New Roman"/>
+                <w:sz w:val="26"/>
+              </w:rPr>
+              <w:t>/api/auth/login</w:t>
+            </w:r>
+          </w:p>
+        </w:tc>
+        <w:tc>
+          <w:tcPr>
+            <w:tcW w:type="dxa" w:w="1728"/>
+            <w:shd w:fill="F9EBEA"/>
+            <w:tcMar>
+              <w:top w:w="60" w:type="dxa"/>
+              <w:bottom w:w="60" w:type="dxa"/>
+              <w:left w:w="60" w:type="dxa"/>
+              <w:right w:w="60" w:type="dxa"/>
+            </w:tcMar>
+          </w:tcPr>
+          <w:p>
+            <w:r>
+              <w:rPr>
+                <w:rFonts w:ascii="Times New Roman" w:hAnsi="Times New Roman"/>
+                <w:sz w:val="26"/>
+              </w:rPr>
+              <w:t>Public</w:t>
+            </w:r>
+          </w:p>
+        </w:tc>
+        <w:tc>
+          <w:tcPr>
+            <w:tcW w:type="dxa" w:w="2880"/>
+            <w:shd w:fill="F9EBEA"/>
+            <w:tcMar>
+              <w:top w:w="60" w:type="dxa"/>
+              <w:bottom w:w="60" w:type="dxa"/>
+              <w:left w:w="60" w:type="dxa"/>
+              <w:right w:w="60" w:type="dxa"/>
+            </w:tcMar>
+          </w:tcPr>
+          <w:p>
+            <w:r>
+              <w:rPr>
+                <w:rFonts w:ascii="Times New Roman" w:hAnsi="Times New Roman"/>
+                <w:sz w:val="26"/>
+              </w:rPr>
+              <w:t>Đăng nhập &amp; Nhận Bearer JWT Token</w:t>
+            </w:r>
+          </w:p>
+        </w:tc>
+      </w:tr>
+      <w:tr>
+        <w:tc>
+          <w:tcPr>
+            <w:tcW w:type="dxa" w:w="1584"/>
+            <w:shd w:fill="F4F6F7"/>
+            <w:tcMar>
+              <w:top w:w="60" w:type="dxa"/>
+              <w:bottom w:w="60" w:type="dxa"/>
+              <w:left w:w="60" w:type="dxa"/>
+              <w:right w:w="60" w:type="dxa"/>
+            </w:tcMar>
+          </w:tcPr>
+          <w:p>
+            <w:r>
+              <w:rPr>
+                <w:rFonts w:ascii="Times New Roman" w:hAnsi="Times New Roman"/>
+                <w:b/>
+                <w:sz w:val="26"/>
+              </w:rPr>
+              <w:t>GET</w:t>
+            </w:r>
+          </w:p>
+        </w:tc>
+        <w:tc>
+          <w:tcPr>
+            <w:tcW w:type="dxa" w:w="3600"/>
+            <w:shd w:fill="F4F6F7"/>
+            <w:tcMar>
+              <w:top w:w="60" w:type="dxa"/>
+              <w:bottom w:w="60" w:type="dxa"/>
+              <w:left w:w="60" w:type="dxa"/>
+              <w:right w:w="60" w:type="dxa"/>
+            </w:tcMar>
+          </w:tcPr>
+          <w:p>
+            <w:r>
+              <w:rPr>
+                <w:rFonts w:ascii="Times New Roman" w:hAnsi="Times New Roman"/>
+                <w:sz w:val="26"/>
+              </w:rPr>
+              <w:t>/api/auth/me</w:t>
+            </w:r>
+          </w:p>
+        </w:tc>
+        <w:tc>
+          <w:tcPr>
+            <w:tcW w:type="dxa" w:w="1728"/>
+            <w:shd w:fill="F4F6F7"/>
+            <w:tcMar>
+              <w:top w:w="60" w:type="dxa"/>
+              <w:bottom w:w="60" w:type="dxa"/>
+              <w:left w:w="60" w:type="dxa"/>
+              <w:right w:w="60" w:type="dxa"/>
+            </w:tcMar>
+          </w:tcPr>
+          <w:p>
+            <w:r>
+              <w:rPr>
+                <w:rFonts w:ascii="Times New Roman" w:hAnsi="Times New Roman"/>
+                <w:sz w:val="26"/>
+              </w:rPr>
+              <w:t>Authenticated</w:t>
+            </w:r>
+          </w:p>
+        </w:tc>
+        <w:tc>
+          <w:tcPr>
+            <w:tcW w:type="dxa" w:w="2880"/>
+            <w:shd w:fill="F4F6F7"/>
+            <w:tcMar>
+              <w:top w:w="60" w:type="dxa"/>
+              <w:bottom w:w="60" w:type="dxa"/>
+              <w:left w:w="60" w:type="dxa"/>
+              <w:right w:w="60" w:type="dxa"/>
+            </w:tcMar>
+          </w:tcPr>
+          <w:p>
+            <w:r>
+              <w:rPr>
+                <w:rFonts w:ascii="Times New Roman" w:hAnsi="Times New Roman"/>
+                <w:sz w:val="26"/>
+              </w:rPr>
+              <w:t>Lấy thông tin tài khoản đang đăng nhập</w:t>
+            </w:r>
+          </w:p>
+        </w:tc>
+      </w:tr>
+      <w:tr>
+        <w:tc>
+          <w:tcPr>
+            <w:tcW w:type="dxa" w:w="1584"/>
+            <w:shd w:fill="F9EBEA"/>
+            <w:tcMar>
+              <w:top w:w="60" w:type="dxa"/>
+              <w:bottom w:w="60" w:type="dxa"/>
+              <w:left w:w="60" w:type="dxa"/>
+              <w:right w:w="60" w:type="dxa"/>
+            </w:tcMar>
+          </w:tcPr>
+          <w:p>
+            <w:r>
+              <w:rPr>
+                <w:rFonts w:ascii="Times New Roman" w:hAnsi="Times New Roman"/>
+                <w:b/>
+                <w:sz w:val="26"/>
+              </w:rPr>
+              <w:t>PUT</w:t>
+            </w:r>
+          </w:p>
+        </w:tc>
+        <w:tc>
+          <w:tcPr>
+            <w:tcW w:type="dxa" w:w="3600"/>
+            <w:shd w:fill="F9EBEA"/>
+            <w:tcMar>
+              <w:top w:w="60" w:type="dxa"/>
+              <w:bottom w:w="60" w:type="dxa"/>
+              <w:left w:w="60" w:type="dxa"/>
+              <w:right w:w="60" w:type="dxa"/>
+            </w:tcMar>
+          </w:tcPr>
+          <w:p>
+            <w:r>
+              <w:rPr>
+                <w:rFonts w:ascii="Times New Roman" w:hAnsi="Times New Roman"/>
+                <w:sz w:val="26"/>
+              </w:rPr>
+              <w:t>/api/auth/update-group</w:t>
+            </w:r>
+          </w:p>
+        </w:tc>
+        <w:tc>
+          <w:tcPr>
+            <w:tcW w:type="dxa" w:w="1728"/>
+            <w:shd w:fill="F9EBEA"/>
+            <w:tcMar>
+              <w:top w:w="60" w:type="dxa"/>
+              <w:bottom w:w="60" w:type="dxa"/>
+              <w:left w:w="60" w:type="dxa"/>
+              <w:right w:w="60" w:type="dxa"/>
+            </w:tcMar>
+          </w:tcPr>
+          <w:p>
+            <w:r>
+              <w:rPr>
+                <w:rFonts w:ascii="Times New Roman" w:hAnsi="Times New Roman"/>
+                <w:sz w:val="26"/>
+              </w:rPr>
+              <w:t>Student</w:t>
+            </w:r>
+          </w:p>
+        </w:tc>
+        <w:tc>
+          <w:tcPr>
+            <w:tcW w:type="dxa" w:w="2880"/>
+            <w:shd w:fill="F9EBEA"/>
+            <w:tcMar>
+              <w:top w:w="60" w:type="dxa"/>
+              <w:bottom w:w="60" w:type="dxa"/>
+              <w:left w:w="60" w:type="dxa"/>
+              <w:right w:w="60" w:type="dxa"/>
+            </w:tcMar>
+          </w:tcPr>
+          <w:p>
+            <w:r>
+              <w:rPr>
+                <w:rFonts w:ascii="Times New Roman" w:hAnsi="Times New Roman"/>
+                <w:sz w:val="26"/>
+              </w:rPr>
+              <w:t>Học viên cập nhật nhóm năng lực cá nhân</w:t>
+            </w:r>
+          </w:p>
+        </w:tc>
+      </w:tr>
+      <w:tr>
+        <w:tc>
+          <w:tcPr>
+            <w:tcW w:type="dxa" w:w="1584"/>
+            <w:shd w:fill="F4F6F7"/>
+            <w:tcMar>
+              <w:top w:w="60" w:type="dxa"/>
+              <w:bottom w:w="60" w:type="dxa"/>
+              <w:left w:w="60" w:type="dxa"/>
+              <w:right w:w="60" w:type="dxa"/>
+            </w:tcMar>
+          </w:tcPr>
+          <w:p>
+            <w:r>
+              <w:rPr>
+                <w:rFonts w:ascii="Times New Roman" w:hAnsi="Times New Roman"/>
+                <w:b/>
+                <w:sz w:val="26"/>
+              </w:rPr>
+              <w:t>GET</w:t>
+            </w:r>
+          </w:p>
+        </w:tc>
+        <w:tc>
+          <w:tcPr>
+            <w:tcW w:type="dxa" w:w="3600"/>
+            <w:shd w:fill="F4F6F7"/>
+            <w:tcMar>
+              <w:top w:w="60" w:type="dxa"/>
+              <w:bottom w:w="60" w:type="dxa"/>
+              <w:left w:w="60" w:type="dxa"/>
+              <w:right w:w="60" w:type="dxa"/>
+            </w:tcMar>
+          </w:tcPr>
+          <w:p>
+            <w:r>
+              <w:rPr>
+                <w:rFonts w:ascii="Times New Roman" w:hAnsi="Times New Roman"/>
+                <w:sz w:val="26"/>
+              </w:rPr>
+              <w:t>/api/auth/students</w:t>
+            </w:r>
+          </w:p>
+        </w:tc>
+        <w:tc>
+          <w:tcPr>
+            <w:tcW w:type="dxa" w:w="1728"/>
+            <w:shd w:fill="F4F6F7"/>
+            <w:tcMar>
+              <w:top w:w="60" w:type="dxa"/>
+              <w:bottom w:w="60" w:type="dxa"/>
+              <w:left w:w="60" w:type="dxa"/>
+              <w:right w:w="60" w:type="dxa"/>
+            </w:tcMar>
+          </w:tcPr>
+          <w:p>
+            <w:r>
+              <w:rPr>
+                <w:rFonts w:ascii="Times New Roman" w:hAnsi="Times New Roman"/>
+                <w:sz w:val="26"/>
+              </w:rPr>
+              <w:t>Admin</w:t>
+            </w:r>
+          </w:p>
+        </w:tc>
+        <w:tc>
+          <w:tcPr>
+            <w:tcW w:type="dxa" w:w="2880"/>
+            <w:shd w:fill="F4F6F7"/>
+            <w:tcMar>
+              <w:top w:w="60" w:type="dxa"/>
+              <w:bottom w:w="60" w:type="dxa"/>
+              <w:left w:w="60" w:type="dxa"/>
+              <w:right w:w="60" w:type="dxa"/>
+            </w:tcMar>
+          </w:tcPr>
+          <w:p>
+            <w:r>
+              <w:rPr>
+                <w:rFonts w:ascii="Times New Roman" w:hAnsi="Times New Roman"/>
+                <w:sz w:val="26"/>
+              </w:rPr>
+              <w:t>Lấy danh sách toàn bộ học viên trong hệ thống</w:t>
+            </w:r>
+          </w:p>
+        </w:tc>
+      </w:tr>
+      <w:tr>
+        <w:tc>
+          <w:tcPr>
+            <w:tcW w:type="dxa" w:w="1584"/>
+            <w:shd w:fill="F9EBEA"/>
+            <w:tcMar>
+              <w:top w:w="60" w:type="dxa"/>
+              <w:bottom w:w="60" w:type="dxa"/>
+              <w:left w:w="60" w:type="dxa"/>
+              <w:right w:w="60" w:type="dxa"/>
+            </w:tcMar>
+          </w:tcPr>
+          <w:p>
+            <w:r>
+              <w:rPr>
+                <w:rFonts w:ascii="Times New Roman" w:hAnsi="Times New Roman"/>
+                <w:b/>
+                <w:sz w:val="26"/>
+              </w:rPr>
+              <w:t>PUT</w:t>
+            </w:r>
+          </w:p>
+        </w:tc>
+        <w:tc>
+          <w:tcPr>
+            <w:tcW w:type="dxa" w:w="3600"/>
+            <w:shd w:fill="F9EBEA"/>
+            <w:tcMar>
+              <w:top w:w="60" w:type="dxa"/>
+              <w:bottom w:w="60" w:type="dxa"/>
+              <w:left w:w="60" w:type="dxa"/>
+              <w:right w:w="60" w:type="dxa"/>
+            </w:tcMar>
+          </w:tcPr>
+          <w:p>
+            <w:r>
+              <w:rPr>
+                <w:rFonts w:ascii="Times New Roman" w:hAnsi="Times New Roman"/>
+                <w:sz w:val="26"/>
+              </w:rPr>
+              <w:t>/api/auth/users/:id</w:t>
+            </w:r>
+          </w:p>
+        </w:tc>
+        <w:tc>
+          <w:tcPr>
+            <w:tcW w:type="dxa" w:w="1728"/>
+            <w:shd w:fill="F9EBEA"/>
+            <w:tcMar>
+              <w:top w:w="60" w:type="dxa"/>
+              <w:bottom w:w="60" w:type="dxa"/>
+              <w:left w:w="60" w:type="dxa"/>
+              <w:right w:w="60" w:type="dxa"/>
+            </w:tcMar>
+          </w:tcPr>
+          <w:p>
+            <w:r>
+              <w:rPr>
+                <w:rFonts w:ascii="Times New Roman" w:hAnsi="Times New Roman"/>
+                <w:sz w:val="26"/>
+              </w:rPr>
+              <w:t>Admin</w:t>
+            </w:r>
+          </w:p>
+        </w:tc>
+        <w:tc>
+          <w:tcPr>
+            <w:tcW w:type="dxa" w:w="2880"/>
+            <w:shd w:fill="F9EBEA"/>
+            <w:tcMar>
+              <w:top w:w="60" w:type="dxa"/>
+              <w:bottom w:w="60" w:type="dxa"/>
+              <w:left w:w="60" w:type="dxa"/>
+              <w:right w:w="60" w:type="dxa"/>
+            </w:tcMar>
+          </w:tcPr>
+          <w:p>
+            <w:r>
+              <w:rPr>
+                <w:rFonts w:ascii="Times New Roman" w:hAnsi="Times New Roman"/>
+                <w:sz w:val="26"/>
+              </w:rPr>
+              <w:t>Admin cập nhật thông tin tài khoản người dùng</w:t>
+            </w:r>
+          </w:p>
+        </w:tc>
+      </w:tr>
+      <w:tr>
+        <w:tc>
+          <w:tcPr>
+            <w:tcW w:type="dxa" w:w="1584"/>
+            <w:shd w:fill="F4F6F7"/>
+            <w:tcMar>
+              <w:top w:w="60" w:type="dxa"/>
+              <w:bottom w:w="60" w:type="dxa"/>
+              <w:left w:w="60" w:type="dxa"/>
+              <w:right w:w="60" w:type="dxa"/>
+            </w:tcMar>
+          </w:tcPr>
+          <w:p>
+            <w:r>
+              <w:rPr>
+                <w:rFonts w:ascii="Times New Roman" w:hAnsi="Times New Roman"/>
+                <w:b/>
+                <w:sz w:val="26"/>
+              </w:rPr>
+              <w:t>DELETE</w:t>
+            </w:r>
+          </w:p>
+        </w:tc>
+        <w:tc>
+          <w:tcPr>
+            <w:tcW w:type="dxa" w:w="3600"/>
+            <w:shd w:fill="F4F6F7"/>
+            <w:tcMar>
+              <w:top w:w="60" w:type="dxa"/>
+              <w:bottom w:w="60" w:type="dxa"/>
+              <w:left w:w="60" w:type="dxa"/>
+              <w:right w:w="60" w:type="dxa"/>
+            </w:tcMar>
+          </w:tcPr>
+          <w:p>
+            <w:r>
+              <w:rPr>
+                <w:rFonts w:ascii="Times New Roman" w:hAnsi="Times New Roman"/>
+                <w:sz w:val="26"/>
+              </w:rPr>
+              <w:t>/api/auth/users/:id</w:t>
+            </w:r>
+          </w:p>
+        </w:tc>
+        <w:tc>
+          <w:tcPr>
+            <w:tcW w:type="dxa" w:w="1728"/>
+            <w:shd w:fill="F4F6F7"/>
+            <w:tcMar>
+              <w:top w:w="60" w:type="dxa"/>
+              <w:bottom w:w="60" w:type="dxa"/>
+              <w:left w:w="60" w:type="dxa"/>
+              <w:right w:w="60" w:type="dxa"/>
+            </w:tcMar>
+          </w:tcPr>
+          <w:p>
+            <w:r>
+              <w:rPr>
+                <w:rFonts w:ascii="Times New Roman" w:hAnsi="Times New Roman"/>
+                <w:sz w:val="26"/>
+              </w:rPr>
+              <w:t>Admin</w:t>
+            </w:r>
+          </w:p>
+        </w:tc>
+        <w:tc>
+          <w:tcPr>
+            <w:tcW w:type="dxa" w:w="2880"/>
+            <w:shd w:fill="F4F6F7"/>
+            <w:tcMar>
+              <w:top w:w="60" w:type="dxa"/>
+              <w:bottom w:w="60" w:type="dxa"/>
+              <w:left w:w="60" w:type="dxa"/>
+              <w:right w:w="60" w:type="dxa"/>
+            </w:tcMar>
+          </w:tcPr>
+          <w:p>
+            <w:r>
+              <w:rPr>
+                <w:rFonts w:ascii="Times New Roman" w:hAnsi="Times New Roman"/>
+                <w:sz w:val="26"/>
+              </w:rPr>
+              <w:t>Admin xóa vĩnh viễn tài khoản khỏi CSDL</w:t>
+            </w:r>
+          </w:p>
+        </w:tc>
+      </w:tr>
+      <w:tr>
+        <w:tc>
+          <w:tcPr>
+            <w:tcW w:type="dxa" w:w="1584"/>
+            <w:shd w:fill="F9EBEA"/>
+            <w:tcMar>
+              <w:top w:w="60" w:type="dxa"/>
+              <w:bottom w:w="60" w:type="dxa"/>
+              <w:left w:w="60" w:type="dxa"/>
+              <w:right w:w="60" w:type="dxa"/>
+            </w:tcMar>
+          </w:tcPr>
+          <w:p>
+            <w:r>
+              <w:rPr>
+                <w:rFonts w:ascii="Times New Roman" w:hAnsi="Times New Roman"/>
+                <w:b/>
+                <w:sz w:val="26"/>
+              </w:rPr>
+              <w:t>PUT</w:t>
+            </w:r>
+          </w:p>
+        </w:tc>
+        <w:tc>
+          <w:tcPr>
+            <w:tcW w:type="dxa" w:w="3600"/>
+            <w:shd w:fill="F9EBEA"/>
+            <w:tcMar>
+              <w:top w:w="60" w:type="dxa"/>
+              <w:bottom w:w="60" w:type="dxa"/>
+              <w:left w:w="60" w:type="dxa"/>
+              <w:right w:w="60" w:type="dxa"/>
+            </w:tcMar>
+          </w:tcPr>
+          <w:p>
+            <w:r>
+              <w:rPr>
+                <w:rFonts w:ascii="Times New Roman" w:hAnsi="Times New Roman"/>
+                <w:sz w:val="26"/>
+              </w:rPr>
+              <w:t>/api/auth/users/:id/override-group</w:t>
+            </w:r>
+          </w:p>
+        </w:tc>
+        <w:tc>
+          <w:tcPr>
+            <w:tcW w:type="dxa" w:w="1728"/>
+            <w:shd w:fill="F9EBEA"/>
+            <w:tcMar>
+              <w:top w:w="60" w:type="dxa"/>
+              <w:bottom w:w="60" w:type="dxa"/>
+              <w:left w:w="60" w:type="dxa"/>
+              <w:right w:w="60" w:type="dxa"/>
+            </w:tcMar>
+          </w:tcPr>
+          <w:p>
+            <w:r>
+              <w:rPr>
+                <w:rFonts w:ascii="Times New Roman" w:hAnsi="Times New Roman"/>
+                <w:sz w:val="26"/>
+              </w:rPr>
+              <w:t>Admin</w:t>
+            </w:r>
+          </w:p>
+        </w:tc>
+        <w:tc>
+          <w:tcPr>
+            <w:tcW w:type="dxa" w:w="2880"/>
+            <w:shd w:fill="F9EBEA"/>
+            <w:tcMar>
+              <w:top w:w="60" w:type="dxa"/>
+              <w:bottom w:w="60" w:type="dxa"/>
+              <w:left w:w="60" w:type="dxa"/>
+              <w:right w:w="60" w:type="dxa"/>
+            </w:tcMar>
+          </w:tcPr>
+          <w:p>
+            <w:r>
+              <w:rPr>
+                <w:rFonts w:ascii="Times New Roman" w:hAnsi="Times New Roman"/>
+                <w:sz w:val="26"/>
+              </w:rPr>
+              <w:t>Admin can thiệp chuyển nhóm năng lực thủ công</w:t>
+            </w:r>
+          </w:p>
+        </w:tc>
+      </w:tr>
+      <w:tr>
+        <w:tc>
+          <w:tcPr>
+            <w:tcW w:type="dxa" w:w="1584"/>
+            <w:shd w:fill="F4F6F7"/>
+            <w:tcMar>
+              <w:top w:w="60" w:type="dxa"/>
+              <w:bottom w:w="60" w:type="dxa"/>
+              <w:left w:w="60" w:type="dxa"/>
+              <w:right w:w="60" w:type="dxa"/>
+            </w:tcMar>
+          </w:tcPr>
+          <w:p>
+            <w:r>
+              <w:rPr>
+                <w:rFonts w:ascii="Times New Roman" w:hAnsi="Times New Roman"/>
+                <w:b/>
+                <w:sz w:val="26"/>
+              </w:rPr>
+              <w:t>POST</w:t>
+            </w:r>
+          </w:p>
+        </w:tc>
+        <w:tc>
+          <w:tcPr>
+            <w:tcW w:type="dxa" w:w="3600"/>
+            <w:shd w:fill="F4F6F7"/>
+            <w:tcMar>
+              <w:top w:w="60" w:type="dxa"/>
+              <w:bottom w:w="60" w:type="dxa"/>
+              <w:left w:w="60" w:type="dxa"/>
+              <w:right w:w="60" w:type="dxa"/>
+            </w:tcMar>
+          </w:tcPr>
+          <w:p>
+            <w:r>
+              <w:rPr>
+                <w:rFonts w:ascii="Times New Roman" w:hAnsi="Times New Roman"/>
+                <w:sz w:val="26"/>
+              </w:rPr>
+              <w:t>/api/auth/ai-monitoring-analysis</w:t>
+            </w:r>
+          </w:p>
+        </w:tc>
+        <w:tc>
+          <w:tcPr>
+            <w:tcW w:type="dxa" w:w="1728"/>
+            <w:shd w:fill="F4F6F7"/>
+            <w:tcMar>
+              <w:top w:w="60" w:type="dxa"/>
+              <w:bottom w:w="60" w:type="dxa"/>
+              <w:left w:w="60" w:type="dxa"/>
+              <w:right w:w="60" w:type="dxa"/>
+            </w:tcMar>
+          </w:tcPr>
+          <w:p>
+            <w:r>
+              <w:rPr>
+                <w:rFonts w:ascii="Times New Roman" w:hAnsi="Times New Roman"/>
+                <w:sz w:val="26"/>
+              </w:rPr>
+              <w:t>Admin</w:t>
+            </w:r>
+          </w:p>
+        </w:tc>
+        <w:tc>
+          <w:tcPr>
+            <w:tcW w:type="dxa" w:w="2880"/>
+            <w:shd w:fill="F4F6F7"/>
+            <w:tcMar>
+              <w:top w:w="60" w:type="dxa"/>
+              <w:bottom w:w="60" w:type="dxa"/>
+              <w:left w:w="60" w:type="dxa"/>
+              <w:right w:w="60" w:type="dxa"/>
+            </w:tcMar>
+          </w:tcPr>
+          <w:p>
+            <w:r>
+              <w:rPr>
+                <w:rFonts w:ascii="Times New Roman" w:hAnsi="Times New Roman"/>
+                <w:sz w:val="26"/>
+              </w:rPr>
+              <w:t>AI phân tích tổng hợp giám sát tiến độ học viên</w:t>
+            </w:r>
+          </w:p>
+        </w:tc>
+      </w:tr>
+      <w:tr>
+        <w:tc>
+          <w:tcPr>
+            <w:tcW w:type="dxa" w:w="1584"/>
+            <w:shd w:fill="F9EBEA"/>
+            <w:tcMar>
+              <w:top w:w="60" w:type="dxa"/>
+              <w:bottom w:w="60" w:type="dxa"/>
+              <w:left w:w="60" w:type="dxa"/>
+              <w:right w:w="60" w:type="dxa"/>
+            </w:tcMar>
+          </w:tcPr>
+          <w:p>
+            <w:r>
+              <w:rPr>
+                <w:rFonts w:ascii="Times New Roman" w:hAnsi="Times New Roman"/>
+                <w:b/>
+                <w:sz w:val="26"/>
+              </w:rPr>
+              <w:t>GET</w:t>
+            </w:r>
+          </w:p>
+        </w:tc>
+        <w:tc>
+          <w:tcPr>
+            <w:tcW w:type="dxa" w:w="3600"/>
+            <w:shd w:fill="F9EBEA"/>
+            <w:tcMar>
+              <w:top w:w="60" w:type="dxa"/>
+              <w:bottom w:w="60" w:type="dxa"/>
+              <w:left w:w="60" w:type="dxa"/>
+              <w:right w:w="60" w:type="dxa"/>
+            </w:tcMar>
+          </w:tcPr>
+          <w:p>
+            <w:r>
+              <w:rPr>
+                <w:rFonts w:ascii="Times New Roman" w:hAnsi="Times New Roman"/>
+                <w:sz w:val="26"/>
+              </w:rPr>
+              <w:t>/api/assignments</w:t>
+            </w:r>
+          </w:p>
+        </w:tc>
+        <w:tc>
+          <w:tcPr>
+            <w:tcW w:type="dxa" w:w="1728"/>
+            <w:shd w:fill="F9EBEA"/>
+            <w:tcMar>
+              <w:top w:w="60" w:type="dxa"/>
+              <w:bottom w:w="60" w:type="dxa"/>
+              <w:left w:w="60" w:type="dxa"/>
+              <w:right w:w="60" w:type="dxa"/>
+            </w:tcMar>
+          </w:tcPr>
+          <w:p>
+            <w:r>
+              <w:rPr>
+                <w:rFonts w:ascii="Times New Roman" w:hAnsi="Times New Roman"/>
+                <w:sz w:val="26"/>
+              </w:rPr>
+              <w:t>Authenticated</w:t>
+            </w:r>
+          </w:p>
+        </w:tc>
+        <w:tc>
+          <w:tcPr>
+            <w:tcW w:type="dxa" w:w="2880"/>
+            <w:shd w:fill="F9EBEA"/>
+            <w:tcMar>
+              <w:top w:w="60" w:type="dxa"/>
+              <w:bottom w:w="60" w:type="dxa"/>
+              <w:left w:w="60" w:type="dxa"/>
+              <w:right w:w="60" w:type="dxa"/>
+            </w:tcMar>
+          </w:tcPr>
+          <w:p>
+            <w:r>
+              <w:rPr>
+                <w:rFonts w:ascii="Times New Roman" w:hAnsi="Times New Roman"/>
+                <w:sz w:val="26"/>
+              </w:rPr>
+              <w:t>Lấy danh sách đề thi (Tự động lọc theo studentGroup)</w:t>
+            </w:r>
+          </w:p>
+        </w:tc>
+      </w:tr>
+      <w:tr>
+        <w:tc>
+          <w:tcPr>
+            <w:tcW w:type="dxa" w:w="1584"/>
+            <w:shd w:fill="F4F6F7"/>
+            <w:tcMar>
+              <w:top w:w="60" w:type="dxa"/>
+              <w:bottom w:w="60" w:type="dxa"/>
+              <w:left w:w="60" w:type="dxa"/>
+              <w:right w:w="60" w:type="dxa"/>
+            </w:tcMar>
+          </w:tcPr>
+          <w:p>
+            <w:r>
+              <w:rPr>
+                <w:rFonts w:ascii="Times New Roman" w:hAnsi="Times New Roman"/>
+                <w:b/>
+                <w:sz w:val="26"/>
+              </w:rPr>
+              <w:t>GET</w:t>
+            </w:r>
+          </w:p>
+        </w:tc>
+        <w:tc>
+          <w:tcPr>
+            <w:tcW w:type="dxa" w:w="3600"/>
+            <w:shd w:fill="F4F6F7"/>
+            <w:tcMar>
+              <w:top w:w="60" w:type="dxa"/>
+              <w:bottom w:w="60" w:type="dxa"/>
+              <w:left w:w="60" w:type="dxa"/>
+              <w:right w:w="60" w:type="dxa"/>
+            </w:tcMar>
+          </w:tcPr>
+          <w:p>
+            <w:r>
+              <w:rPr>
+                <w:rFonts w:ascii="Times New Roman" w:hAnsi="Times New Roman"/>
+                <w:sz w:val="26"/>
+              </w:rPr>
+              <w:t>/api/assignments/:id</w:t>
+            </w:r>
+          </w:p>
+        </w:tc>
+        <w:tc>
+          <w:tcPr>
+            <w:tcW w:type="dxa" w:w="1728"/>
+            <w:shd w:fill="F4F6F7"/>
+            <w:tcMar>
+              <w:top w:w="60" w:type="dxa"/>
+              <w:bottom w:w="60" w:type="dxa"/>
+              <w:left w:w="60" w:type="dxa"/>
+              <w:right w:w="60" w:type="dxa"/>
+            </w:tcMar>
+          </w:tcPr>
+          <w:p>
+            <w:r>
+              <w:rPr>
+                <w:rFonts w:ascii="Times New Roman" w:hAnsi="Times New Roman"/>
+                <w:sz w:val="26"/>
+              </w:rPr>
+              <w:t>Authenticated</w:t>
+            </w:r>
+          </w:p>
+        </w:tc>
+        <w:tc>
+          <w:tcPr>
+            <w:tcW w:type="dxa" w:w="2880"/>
+            <w:shd w:fill="F4F6F7"/>
+            <w:tcMar>
+              <w:top w:w="60" w:type="dxa"/>
+              <w:bottom w:w="60" w:type="dxa"/>
+              <w:left w:w="60" w:type="dxa"/>
+              <w:right w:w="60" w:type="dxa"/>
+            </w:tcMar>
+          </w:tcPr>
+          <w:p>
+            <w:r>
+              <w:rPr>
+                <w:rFonts w:ascii="Times New Roman" w:hAnsi="Times New Roman"/>
+                <w:sz w:val="26"/>
+              </w:rPr>
+              <w:t>Lấy thông tin chi tiết 1 đề thi theo ID</w:t>
+            </w:r>
+          </w:p>
+        </w:tc>
+      </w:tr>
+      <w:tr>
+        <w:tc>
+          <w:tcPr>
+            <w:tcW w:type="dxa" w:w="1584"/>
+            <w:shd w:fill="F9EBEA"/>
+            <w:tcMar>
+              <w:top w:w="60" w:type="dxa"/>
+              <w:bottom w:w="60" w:type="dxa"/>
+              <w:left w:w="60" w:type="dxa"/>
+              <w:right w:w="60" w:type="dxa"/>
+            </w:tcMar>
+          </w:tcPr>
+          <w:p>
+            <w:r>
+              <w:rPr>
+                <w:rFonts w:ascii="Times New Roman" w:hAnsi="Times New Roman"/>
+                <w:b/>
+                <w:sz w:val="26"/>
+              </w:rPr>
+              <w:t>POST</w:t>
+            </w:r>
+          </w:p>
+        </w:tc>
+        <w:tc>
+          <w:tcPr>
+            <w:tcW w:type="dxa" w:w="3600"/>
+            <w:shd w:fill="F9EBEA"/>
+            <w:tcMar>
+              <w:top w:w="60" w:type="dxa"/>
+              <w:bottom w:w="60" w:type="dxa"/>
+              <w:left w:w="60" w:type="dxa"/>
+              <w:right w:w="60" w:type="dxa"/>
+            </w:tcMar>
+          </w:tcPr>
+          <w:p>
+            <w:r>
+              <w:rPr>
+                <w:rFonts w:ascii="Times New Roman" w:hAnsi="Times New Roman"/>
+                <w:sz w:val="26"/>
+              </w:rPr>
+              <w:t>/api/assignments</w:t>
+            </w:r>
+          </w:p>
+        </w:tc>
+        <w:tc>
+          <w:tcPr>
+            <w:tcW w:type="dxa" w:w="1728"/>
+            <w:shd w:fill="F9EBEA"/>
+            <w:tcMar>
+              <w:top w:w="60" w:type="dxa"/>
+              <w:bottom w:w="60" w:type="dxa"/>
+              <w:left w:w="60" w:type="dxa"/>
+              <w:right w:w="60" w:type="dxa"/>
+            </w:tcMar>
+          </w:tcPr>
+          <w:p>
+            <w:r>
+              <w:rPr>
+                <w:rFonts w:ascii="Times New Roman" w:hAnsi="Times New Roman"/>
+                <w:sz w:val="26"/>
+              </w:rPr>
+              <w:t>Admin</w:t>
+            </w:r>
+          </w:p>
+        </w:tc>
+        <w:tc>
+          <w:tcPr>
+            <w:tcW w:type="dxa" w:w="2880"/>
+            <w:shd w:fill="F9EBEA"/>
+            <w:tcMar>
+              <w:top w:w="60" w:type="dxa"/>
+              <w:bottom w:w="60" w:type="dxa"/>
+              <w:left w:w="60" w:type="dxa"/>
+              <w:right w:w="60" w:type="dxa"/>
+            </w:tcMar>
+          </w:tcPr>
+          <w:p>
+            <w:r>
+              <w:rPr>
+                <w:rFonts w:ascii="Times New Roman" w:hAnsi="Times New Roman"/>
+                <w:sz w:val="26"/>
+              </w:rPr>
+              <w:t>Tạo đề thi mới (Dàn ý 4 phần + 3 bài mẫu 3 Band)</w:t>
+            </w:r>
+          </w:p>
+        </w:tc>
+      </w:tr>
+      <w:tr>
+        <w:tc>
+          <w:tcPr>
+            <w:tcW w:type="dxa" w:w="1584"/>
+            <w:shd w:fill="F4F6F7"/>
+            <w:tcMar>
+              <w:top w:w="60" w:type="dxa"/>
+              <w:bottom w:w="60" w:type="dxa"/>
+              <w:left w:w="60" w:type="dxa"/>
+              <w:right w:w="60" w:type="dxa"/>
+            </w:tcMar>
+          </w:tcPr>
+          <w:p>
+            <w:r>
+              <w:rPr>
+                <w:rFonts w:ascii="Times New Roman" w:hAnsi="Times New Roman"/>
+                <w:b/>
+                <w:sz w:val="26"/>
+              </w:rPr>
+              <w:t>PUT</w:t>
+            </w:r>
+          </w:p>
+        </w:tc>
+        <w:tc>
+          <w:tcPr>
+            <w:tcW w:type="dxa" w:w="3600"/>
+            <w:shd w:fill="F4F6F7"/>
+            <w:tcMar>
+              <w:top w:w="60" w:type="dxa"/>
+              <w:bottom w:w="60" w:type="dxa"/>
+              <w:left w:w="60" w:type="dxa"/>
+              <w:right w:w="60" w:type="dxa"/>
+            </w:tcMar>
+          </w:tcPr>
+          <w:p>
+            <w:r>
+              <w:rPr>
+                <w:rFonts w:ascii="Times New Roman" w:hAnsi="Times New Roman"/>
+                <w:sz w:val="26"/>
+              </w:rPr>
+              <w:t>/api/assignments/:id</w:t>
+            </w:r>
+          </w:p>
+        </w:tc>
+        <w:tc>
+          <w:tcPr>
+            <w:tcW w:type="dxa" w:w="1728"/>
+            <w:shd w:fill="F4F6F7"/>
+            <w:tcMar>
+              <w:top w:w="60" w:type="dxa"/>
+              <w:bottom w:w="60" w:type="dxa"/>
+              <w:left w:w="60" w:type="dxa"/>
+              <w:right w:w="60" w:type="dxa"/>
+            </w:tcMar>
+          </w:tcPr>
+          <w:p>
+            <w:r>
+              <w:rPr>
+                <w:rFonts w:ascii="Times New Roman" w:hAnsi="Times New Roman"/>
+                <w:sz w:val="26"/>
+              </w:rPr>
+              <w:t>Admin</w:t>
+            </w:r>
+          </w:p>
+        </w:tc>
+        <w:tc>
+          <w:tcPr>
+            <w:tcW w:type="dxa" w:w="2880"/>
+            <w:shd w:fill="F4F6F7"/>
+            <w:tcMar>
+              <w:top w:w="60" w:type="dxa"/>
+              <w:bottom w:w="60" w:type="dxa"/>
+              <w:left w:w="60" w:type="dxa"/>
+              <w:right w:w="60" w:type="dxa"/>
+            </w:tcMar>
+          </w:tcPr>
+          <w:p>
+            <w:r>
+              <w:rPr>
+                <w:rFonts w:ascii="Times New Roman" w:hAnsi="Times New Roman"/>
+                <w:sz w:val="26"/>
+              </w:rPr>
+              <w:t>Chỉnh sửa nội dung đề thi, bài mẫu và dàn ý</w:t>
+            </w:r>
+          </w:p>
+        </w:tc>
+      </w:tr>
+      <w:tr>
+        <w:tc>
+          <w:tcPr>
+            <w:tcW w:type="dxa" w:w="1584"/>
+            <w:shd w:fill="F9EBEA"/>
+            <w:tcMar>
+              <w:top w:w="60" w:type="dxa"/>
+              <w:bottom w:w="60" w:type="dxa"/>
+              <w:left w:w="60" w:type="dxa"/>
+              <w:right w:w="60" w:type="dxa"/>
+            </w:tcMar>
+          </w:tcPr>
+          <w:p>
+            <w:r>
+              <w:rPr>
+                <w:rFonts w:ascii="Times New Roman" w:hAnsi="Times New Roman"/>
+                <w:b/>
+                <w:sz w:val="26"/>
+              </w:rPr>
+              <w:t>DELETE</w:t>
+            </w:r>
+          </w:p>
+        </w:tc>
+        <w:tc>
+          <w:tcPr>
+            <w:tcW w:type="dxa" w:w="3600"/>
+            <w:shd w:fill="F9EBEA"/>
+            <w:tcMar>
+              <w:top w:w="60" w:type="dxa"/>
+              <w:bottom w:w="60" w:type="dxa"/>
+              <w:left w:w="60" w:type="dxa"/>
+              <w:right w:w="60" w:type="dxa"/>
+            </w:tcMar>
+          </w:tcPr>
+          <w:p>
+            <w:r>
+              <w:rPr>
+                <w:rFonts w:ascii="Times New Roman" w:hAnsi="Times New Roman"/>
+                <w:sz w:val="26"/>
+              </w:rPr>
+              <w:t>/api/assignments/:id</w:t>
+            </w:r>
+          </w:p>
+        </w:tc>
+        <w:tc>
+          <w:tcPr>
+            <w:tcW w:type="dxa" w:w="1728"/>
+            <w:shd w:fill="F9EBEA"/>
+            <w:tcMar>
+              <w:top w:w="60" w:type="dxa"/>
+              <w:bottom w:w="60" w:type="dxa"/>
+              <w:left w:w="60" w:type="dxa"/>
+              <w:right w:w="60" w:type="dxa"/>
+            </w:tcMar>
+          </w:tcPr>
+          <w:p>
+            <w:r>
+              <w:rPr>
+                <w:rFonts w:ascii="Times New Roman" w:hAnsi="Times New Roman"/>
+                <w:sz w:val="26"/>
+              </w:rPr>
+              <w:t>Admin</w:t>
+            </w:r>
+          </w:p>
+        </w:tc>
+        <w:tc>
+          <w:tcPr>
+            <w:tcW w:type="dxa" w:w="2880"/>
+            <w:shd w:fill="F9EBEA"/>
+            <w:tcMar>
+              <w:top w:w="60" w:type="dxa"/>
+              <w:bottom w:w="60" w:type="dxa"/>
+              <w:left w:w="60" w:type="dxa"/>
+              <w:right w:w="60" w:type="dxa"/>
+            </w:tcMar>
+          </w:tcPr>
+          <w:p>
+            <w:r>
+              <w:rPr>
+                <w:rFonts w:ascii="Times New Roman" w:hAnsi="Times New Roman"/>
+                <w:sz w:val="26"/>
+              </w:rPr>
+              <w:t>Xóa hoàn toàn đề thi khỏi hệ thống</w:t>
+            </w:r>
+          </w:p>
+        </w:tc>
+      </w:tr>
+      <w:tr>
+        <w:tc>
+          <w:tcPr>
+            <w:tcW w:type="dxa" w:w="1584"/>
+            <w:shd w:fill="F4F6F7"/>
+            <w:tcMar>
+              <w:top w:w="60" w:type="dxa"/>
+              <w:bottom w:w="60" w:type="dxa"/>
+              <w:left w:w="60" w:type="dxa"/>
+              <w:right w:w="60" w:type="dxa"/>
+            </w:tcMar>
+          </w:tcPr>
+          <w:p>
+            <w:r>
+              <w:rPr>
+                <w:rFonts w:ascii="Times New Roman" w:hAnsi="Times New Roman"/>
+                <w:b/>
+                <w:sz w:val="26"/>
+              </w:rPr>
+              <w:t>POST</w:t>
+            </w:r>
+          </w:p>
+        </w:tc>
+        <w:tc>
+          <w:tcPr>
+            <w:tcW w:type="dxa" w:w="3600"/>
+            <w:shd w:fill="F4F6F7"/>
+            <w:tcMar>
+              <w:top w:w="60" w:type="dxa"/>
+              <w:bottom w:w="60" w:type="dxa"/>
+              <w:left w:w="60" w:type="dxa"/>
+              <w:right w:w="60" w:type="dxa"/>
+            </w:tcMar>
+          </w:tcPr>
+          <w:p>
+            <w:r>
+              <w:rPr>
+                <w:rFonts w:ascii="Times New Roman" w:hAnsi="Times New Roman"/>
+                <w:sz w:val="26"/>
+              </w:rPr>
+              <w:t>/api/assignments/:id/generate-adaptive-sample</w:t>
+            </w:r>
+          </w:p>
+        </w:tc>
+        <w:tc>
+          <w:tcPr>
+            <w:tcW w:type="dxa" w:w="1728"/>
+            <w:shd w:fill="F4F6F7"/>
+            <w:tcMar>
+              <w:top w:w="60" w:type="dxa"/>
+              <w:bottom w:w="60" w:type="dxa"/>
+              <w:left w:w="60" w:type="dxa"/>
+              <w:right w:w="60" w:type="dxa"/>
+            </w:tcMar>
+          </w:tcPr>
+          <w:p>
+            <w:r>
+              <w:rPr>
+                <w:rFonts w:ascii="Times New Roman" w:hAnsi="Times New Roman"/>
+                <w:sz w:val="26"/>
+              </w:rPr>
+              <w:t>Authenticated</w:t>
+            </w:r>
+          </w:p>
+        </w:tc>
+        <w:tc>
+          <w:tcPr>
+            <w:tcW w:type="dxa" w:w="2880"/>
+            <w:shd w:fill="F4F6F7"/>
+            <w:tcMar>
+              <w:top w:w="60" w:type="dxa"/>
+              <w:bottom w:w="60" w:type="dxa"/>
+              <w:left w:w="60" w:type="dxa"/>
+              <w:right w:w="60" w:type="dxa"/>
+            </w:tcMar>
+          </w:tcPr>
+          <w:p>
+            <w:r>
+              <w:rPr>
+                <w:rFonts w:ascii="Times New Roman" w:hAnsi="Times New Roman"/>
+                <w:sz w:val="26"/>
+              </w:rPr>
+              <w:t>AI sinh bài mẫu thích ứng linh hoạt theo Band điểm</w:t>
+            </w:r>
+          </w:p>
+        </w:tc>
+      </w:tr>
+      <w:tr>
+        <w:tc>
+          <w:tcPr>
+            <w:tcW w:type="dxa" w:w="1584"/>
+            <w:shd w:fill="F9EBEA"/>
+            <w:tcMar>
+              <w:top w:w="60" w:type="dxa"/>
+              <w:bottom w:w="60" w:type="dxa"/>
+              <w:left w:w="60" w:type="dxa"/>
+              <w:right w:w="60" w:type="dxa"/>
+            </w:tcMar>
+          </w:tcPr>
+          <w:p>
+            <w:r>
+              <w:rPr>
+                <w:rFonts w:ascii="Times New Roman" w:hAnsi="Times New Roman"/>
+                <w:b/>
+                <w:sz w:val="26"/>
+              </w:rPr>
+              <w:t>POST</w:t>
+            </w:r>
+          </w:p>
+        </w:tc>
+        <w:tc>
+          <w:tcPr>
+            <w:tcW w:type="dxa" w:w="3600"/>
+            <w:shd w:fill="F9EBEA"/>
+            <w:tcMar>
+              <w:top w:w="60" w:type="dxa"/>
+              <w:bottom w:w="60" w:type="dxa"/>
+              <w:left w:w="60" w:type="dxa"/>
+              <w:right w:w="60" w:type="dxa"/>
+            </w:tcMar>
+          </w:tcPr>
+          <w:p>
+            <w:r>
+              <w:rPr>
+                <w:rFonts w:ascii="Times New Roman" w:hAnsi="Times New Roman"/>
+                <w:sz w:val="26"/>
+              </w:rPr>
+              <w:t>/api/grading/submit</w:t>
+            </w:r>
+          </w:p>
+        </w:tc>
+        <w:tc>
+          <w:tcPr>
+            <w:tcW w:type="dxa" w:w="1728"/>
+            <w:shd w:fill="F9EBEA"/>
+            <w:tcMar>
+              <w:top w:w="60" w:type="dxa"/>
+              <w:bottom w:w="60" w:type="dxa"/>
+              <w:left w:w="60" w:type="dxa"/>
+              <w:right w:w="60" w:type="dxa"/>
+            </w:tcMar>
+          </w:tcPr>
+          <w:p>
+            <w:r>
+              <w:rPr>
+                <w:rFonts w:ascii="Times New Roman" w:hAnsi="Times New Roman"/>
+                <w:sz w:val="26"/>
+              </w:rPr>
+              <w:t>Student</w:t>
+            </w:r>
+          </w:p>
+        </w:tc>
+        <w:tc>
+          <w:tcPr>
+            <w:tcW w:type="dxa" w:w="2880"/>
+            <w:shd w:fill="F9EBEA"/>
+            <w:tcMar>
+              <w:top w:w="60" w:type="dxa"/>
+              <w:bottom w:w="60" w:type="dxa"/>
+              <w:left w:w="60" w:type="dxa"/>
+              <w:right w:w="60" w:type="dxa"/>
+            </w:tcMar>
+          </w:tcPr>
+          <w:p>
+            <w:r>
+              <w:rPr>
+                <w:rFonts w:ascii="Times New Roman" w:hAnsi="Times New Roman"/>
+                <w:sz w:val="26"/>
+              </w:rPr>
+              <w:t>Nộp bài luận chấm điểm AI GPT-4o bám sát Rubric</w:t>
+            </w:r>
+          </w:p>
+        </w:tc>
+      </w:tr>
+      <w:tr>
+        <w:tc>
+          <w:tcPr>
+            <w:tcW w:type="dxa" w:w="1584"/>
+            <w:shd w:fill="F4F6F7"/>
+            <w:tcMar>
+              <w:top w:w="60" w:type="dxa"/>
+              <w:bottom w:w="60" w:type="dxa"/>
+              <w:left w:w="60" w:type="dxa"/>
+              <w:right w:w="60" w:type="dxa"/>
+            </w:tcMar>
+          </w:tcPr>
+          <w:p>
+            <w:r>
+              <w:rPr>
+                <w:rFonts w:ascii="Times New Roman" w:hAnsi="Times New Roman"/>
+                <w:b/>
+                <w:sz w:val="26"/>
+              </w:rPr>
+              <w:t>POST</w:t>
+            </w:r>
+          </w:p>
+        </w:tc>
+        <w:tc>
+          <w:tcPr>
+            <w:tcW w:type="dxa" w:w="3600"/>
+            <w:shd w:fill="F4F6F7"/>
+            <w:tcMar>
+              <w:top w:w="60" w:type="dxa"/>
+              <w:bottom w:w="60" w:type="dxa"/>
+              <w:left w:w="60" w:type="dxa"/>
+              <w:right w:w="60" w:type="dxa"/>
+            </w:tcMar>
+          </w:tcPr>
+          <w:p>
+            <w:r>
+              <w:rPr>
+                <w:rFonts w:ascii="Times New Roman" w:hAnsi="Times New Roman"/>
+                <w:sz w:val="26"/>
+              </w:rPr>
+              <w:t>/api/grading/submit-promotion-test</w:t>
+            </w:r>
+          </w:p>
+        </w:tc>
+        <w:tc>
+          <w:tcPr>
+            <w:tcW w:type="dxa" w:w="1728"/>
+            <w:shd w:fill="F4F6F7"/>
+            <w:tcMar>
+              <w:top w:w="60" w:type="dxa"/>
+              <w:bottom w:w="60" w:type="dxa"/>
+              <w:left w:w="60" w:type="dxa"/>
+              <w:right w:w="60" w:type="dxa"/>
+            </w:tcMar>
+          </w:tcPr>
+          <w:p>
+            <w:r>
+              <w:rPr>
+                <w:rFonts w:ascii="Times New Roman" w:hAnsi="Times New Roman"/>
+                <w:sz w:val="26"/>
+              </w:rPr>
+              <w:t>Student</w:t>
+            </w:r>
+          </w:p>
+        </w:tc>
+        <w:tc>
+          <w:tcPr>
+            <w:tcW w:type="dxa" w:w="2880"/>
+            <w:shd w:fill="F4F6F7"/>
+            <w:tcMar>
+              <w:top w:w="60" w:type="dxa"/>
+              <w:bottom w:w="60" w:type="dxa"/>
+              <w:left w:w="60" w:type="dxa"/>
+              <w:right w:w="60" w:type="dxa"/>
+            </w:tcMar>
+          </w:tcPr>
+          <w:p>
+            <w:r>
+              <w:rPr>
+                <w:rFonts w:ascii="Times New Roman" w:hAnsi="Times New Roman"/>
+                <w:sz w:val="26"/>
+              </w:rPr>
+              <w:t>Nộp bài Thi Chuyển Cấp &amp; Thực hiện Level Migration</w:t>
+            </w:r>
+          </w:p>
+        </w:tc>
+      </w:tr>
+      <w:tr>
+        <w:tc>
+          <w:tcPr>
+            <w:tcW w:type="dxa" w:w="1584"/>
+            <w:shd w:fill="F9EBEA"/>
+            <w:tcMar>
+              <w:top w:w="60" w:type="dxa"/>
+              <w:bottom w:w="60" w:type="dxa"/>
+              <w:left w:w="60" w:type="dxa"/>
+              <w:right w:w="60" w:type="dxa"/>
+            </w:tcMar>
+          </w:tcPr>
+          <w:p>
+            <w:r>
+              <w:rPr>
+                <w:rFonts w:ascii="Times New Roman" w:hAnsi="Times New Roman"/>
+                <w:b/>
+                <w:sz w:val="26"/>
+              </w:rPr>
+              <w:t>POST</w:t>
+            </w:r>
+          </w:p>
+        </w:tc>
+        <w:tc>
+          <w:tcPr>
+            <w:tcW w:type="dxa" w:w="3600"/>
+            <w:shd w:fill="F9EBEA"/>
+            <w:tcMar>
+              <w:top w:w="60" w:type="dxa"/>
+              <w:bottom w:w="60" w:type="dxa"/>
+              <w:left w:w="60" w:type="dxa"/>
+              <w:right w:w="60" w:type="dxa"/>
+            </w:tcMar>
+          </w:tcPr>
+          <w:p>
+            <w:r>
+              <w:rPr>
+                <w:rFonts w:ascii="Times New Roman" w:hAnsi="Times New Roman"/>
+                <w:sz w:val="26"/>
+              </w:rPr>
+              <w:t>/api/grading/generate-promotion-prompt</w:t>
+            </w:r>
+          </w:p>
+        </w:tc>
+        <w:tc>
+          <w:tcPr>
+            <w:tcW w:type="dxa" w:w="1728"/>
+            <w:shd w:fill="F9EBEA"/>
+            <w:tcMar>
+              <w:top w:w="60" w:type="dxa"/>
+              <w:bottom w:w="60" w:type="dxa"/>
+              <w:left w:w="60" w:type="dxa"/>
+              <w:right w:w="60" w:type="dxa"/>
+            </w:tcMar>
+          </w:tcPr>
+          <w:p>
+            <w:r>
+              <w:rPr>
+                <w:rFonts w:ascii="Times New Roman" w:hAnsi="Times New Roman"/>
+                <w:sz w:val="26"/>
+              </w:rPr>
+              <w:t>Authenticated</w:t>
+            </w:r>
+          </w:p>
+        </w:tc>
+        <w:tc>
+          <w:tcPr>
+            <w:tcW w:type="dxa" w:w="2880"/>
+            <w:shd w:fill="F9EBEA"/>
+            <w:tcMar>
+              <w:top w:w="60" w:type="dxa"/>
+              <w:bottom w:w="60" w:type="dxa"/>
+              <w:left w:w="60" w:type="dxa"/>
+              <w:right w:w="60" w:type="dxa"/>
+            </w:tcMar>
+          </w:tcPr>
+          <w:p>
+            <w:r>
+              <w:rPr>
+                <w:rFonts w:ascii="Times New Roman" w:hAnsi="Times New Roman"/>
+                <w:sz w:val="26"/>
+              </w:rPr>
+              <w:t>AI sinh đề thi độc bản Task 2 cho nhóm Xuất Sắc</w:t>
+            </w:r>
+          </w:p>
+        </w:tc>
+      </w:tr>
+      <w:tr>
+        <w:tc>
+          <w:tcPr>
+            <w:tcW w:type="dxa" w:w="1584"/>
+            <w:shd w:fill="F4F6F7"/>
+            <w:tcMar>
+              <w:top w:w="60" w:type="dxa"/>
+              <w:bottom w:w="60" w:type="dxa"/>
+              <w:left w:w="60" w:type="dxa"/>
+              <w:right w:w="60" w:type="dxa"/>
+            </w:tcMar>
+          </w:tcPr>
+          <w:p>
+            <w:r>
+              <w:rPr>
+                <w:rFonts w:ascii="Times New Roman" w:hAnsi="Times New Roman"/>
+                <w:b/>
+                <w:sz w:val="26"/>
+              </w:rPr>
+              <w:t>POST</w:t>
+            </w:r>
+          </w:p>
+        </w:tc>
+        <w:tc>
+          <w:tcPr>
+            <w:tcW w:type="dxa" w:w="3600"/>
+            <w:shd w:fill="F4F6F7"/>
+            <w:tcMar>
+              <w:top w:w="60" w:type="dxa"/>
+              <w:bottom w:w="60" w:type="dxa"/>
+              <w:left w:w="60" w:type="dxa"/>
+              <w:right w:w="60" w:type="dxa"/>
+            </w:tcMar>
+          </w:tcPr>
+          <w:p>
+            <w:r>
+              <w:rPr>
+                <w:rFonts w:ascii="Times New Roman" w:hAnsi="Times New Roman"/>
+                <w:sz w:val="26"/>
+              </w:rPr>
+              <w:t>/api/grading/generate-ai-exam</w:t>
+            </w:r>
+          </w:p>
+        </w:tc>
+        <w:tc>
+          <w:tcPr>
+            <w:tcW w:type="dxa" w:w="1728"/>
+            <w:shd w:fill="F4F6F7"/>
+            <w:tcMar>
+              <w:top w:w="60" w:type="dxa"/>
+              <w:bottom w:w="60" w:type="dxa"/>
+              <w:left w:w="60" w:type="dxa"/>
+              <w:right w:w="60" w:type="dxa"/>
+            </w:tcMar>
+          </w:tcPr>
+          <w:p>
+            <w:r>
+              <w:rPr>
+                <w:rFonts w:ascii="Times New Roman" w:hAnsi="Times New Roman"/>
+                <w:sz w:val="26"/>
+              </w:rPr>
+              <w:t>Authenticated</w:t>
+            </w:r>
+          </w:p>
+        </w:tc>
+        <w:tc>
+          <w:tcPr>
+            <w:tcW w:type="dxa" w:w="2880"/>
+            <w:shd w:fill="F4F6F7"/>
+            <w:tcMar>
+              <w:top w:w="60" w:type="dxa"/>
+              <w:bottom w:w="60" w:type="dxa"/>
+              <w:left w:w="60" w:type="dxa"/>
+              <w:right w:w="60" w:type="dxa"/>
+            </w:tcMar>
+          </w:tcPr>
+          <w:p>
+            <w:r>
+              <w:rPr>
+                <w:rFonts w:ascii="Times New Roman" w:hAnsi="Times New Roman"/>
+                <w:sz w:val="26"/>
+              </w:rPr>
+              <w:t>Alias Route sinh đề thi AI độc bản</w:t>
+            </w:r>
+          </w:p>
+        </w:tc>
+      </w:tr>
+      <w:tr>
+        <w:tc>
+          <w:tcPr>
+            <w:tcW w:type="dxa" w:w="1584"/>
+            <w:shd w:fill="F9EBEA"/>
+            <w:tcMar>
+              <w:top w:w="60" w:type="dxa"/>
+              <w:bottom w:w="60" w:type="dxa"/>
+              <w:left w:w="60" w:type="dxa"/>
+              <w:right w:w="60" w:type="dxa"/>
+            </w:tcMar>
+          </w:tcPr>
+          <w:p>
+            <w:r>
+              <w:rPr>
+                <w:rFonts w:ascii="Times New Roman" w:hAnsi="Times New Roman"/>
+                <w:b/>
+                <w:sz w:val="26"/>
+              </w:rPr>
+              <w:t>GET</w:t>
+            </w:r>
+          </w:p>
+        </w:tc>
+        <w:tc>
+          <w:tcPr>
+            <w:tcW w:type="dxa" w:w="3600"/>
+            <w:shd w:fill="F9EBEA"/>
+            <w:tcMar>
+              <w:top w:w="60" w:type="dxa"/>
+              <w:bottom w:w="60" w:type="dxa"/>
+              <w:left w:w="60" w:type="dxa"/>
+              <w:right w:w="60" w:type="dxa"/>
+            </w:tcMar>
+          </w:tcPr>
+          <w:p>
+            <w:r>
+              <w:rPr>
+                <w:rFonts w:ascii="Times New Roman" w:hAnsi="Times New Roman"/>
+                <w:sz w:val="26"/>
+              </w:rPr>
+              <w:t>/api/rubrics</w:t>
+            </w:r>
+          </w:p>
+        </w:tc>
+        <w:tc>
+          <w:tcPr>
+            <w:tcW w:type="dxa" w:w="1728"/>
+            <w:shd w:fill="F9EBEA"/>
+            <w:tcMar>
+              <w:top w:w="60" w:type="dxa"/>
+              <w:bottom w:w="60" w:type="dxa"/>
+              <w:left w:w="60" w:type="dxa"/>
+              <w:right w:w="60" w:type="dxa"/>
+            </w:tcMar>
+          </w:tcPr>
+          <w:p>
+            <w:r>
+              <w:rPr>
+                <w:rFonts w:ascii="Times New Roman" w:hAnsi="Times New Roman"/>
+                <w:sz w:val="26"/>
+              </w:rPr>
+              <w:t>Authenticated</w:t>
+            </w:r>
+          </w:p>
+        </w:tc>
+        <w:tc>
+          <w:tcPr>
+            <w:tcW w:type="dxa" w:w="2880"/>
+            <w:shd w:fill="F9EBEA"/>
+            <w:tcMar>
+              <w:top w:w="60" w:type="dxa"/>
+              <w:bottom w:w="60" w:type="dxa"/>
+              <w:left w:w="60" w:type="dxa"/>
+              <w:right w:w="60" w:type="dxa"/>
+            </w:tcMar>
+          </w:tcPr>
+          <w:p>
+            <w:r>
+              <w:rPr>
+                <w:rFonts w:ascii="Times New Roman" w:hAnsi="Times New Roman"/>
+                <w:sz w:val="26"/>
+              </w:rPr>
+              <w:t>Lấy danh sách 4 tiêu chí Rubric (TR, CC, LR, GRA)</w:t>
+            </w:r>
+          </w:p>
+        </w:tc>
+      </w:tr>
+      <w:tr>
+        <w:tc>
+          <w:tcPr>
+            <w:tcW w:type="dxa" w:w="1584"/>
+            <w:shd w:fill="F4F6F7"/>
+            <w:tcMar>
+              <w:top w:w="60" w:type="dxa"/>
+              <w:bottom w:w="60" w:type="dxa"/>
+              <w:left w:w="60" w:type="dxa"/>
+              <w:right w:w="60" w:type="dxa"/>
+            </w:tcMar>
+          </w:tcPr>
+          <w:p>
+            <w:r>
+              <w:rPr>
+                <w:rFonts w:ascii="Times New Roman" w:hAnsi="Times New Roman"/>
+                <w:b/>
+                <w:sz w:val="26"/>
+              </w:rPr>
+              <w:t>PUT</w:t>
+            </w:r>
+          </w:p>
+        </w:tc>
+        <w:tc>
+          <w:tcPr>
+            <w:tcW w:type="dxa" w:w="3600"/>
+            <w:shd w:fill="F4F6F7"/>
+            <w:tcMar>
+              <w:top w:w="60" w:type="dxa"/>
+              <w:bottom w:w="60" w:type="dxa"/>
+              <w:left w:w="60" w:type="dxa"/>
+              <w:right w:w="60" w:type="dxa"/>
+            </w:tcMar>
+          </w:tcPr>
+          <w:p>
+            <w:r>
+              <w:rPr>
+                <w:rFonts w:ascii="Times New Roman" w:hAnsi="Times New Roman"/>
+                <w:sz w:val="26"/>
+              </w:rPr>
+              <w:t>/api/rubrics/:key</w:t>
+            </w:r>
+          </w:p>
+        </w:tc>
+        <w:tc>
+          <w:tcPr>
+            <w:tcW w:type="dxa" w:w="1728"/>
+            <w:shd w:fill="F4F6F7"/>
+            <w:tcMar>
+              <w:top w:w="60" w:type="dxa"/>
+              <w:bottom w:w="60" w:type="dxa"/>
+              <w:left w:w="60" w:type="dxa"/>
+              <w:right w:w="60" w:type="dxa"/>
+            </w:tcMar>
+          </w:tcPr>
+          <w:p>
+            <w:r>
+              <w:rPr>
+                <w:rFonts w:ascii="Times New Roman" w:hAnsi="Times New Roman"/>
+                <w:sz w:val="26"/>
+              </w:rPr>
+              <w:t>Admin</w:t>
+            </w:r>
+          </w:p>
+        </w:tc>
+        <w:tc>
+          <w:tcPr>
+            <w:tcW w:type="dxa" w:w="2880"/>
+            <w:shd w:fill="F4F6F7"/>
+            <w:tcMar>
+              <w:top w:w="60" w:type="dxa"/>
+              <w:bottom w:w="60" w:type="dxa"/>
+              <w:left w:w="60" w:type="dxa"/>
+              <w:right w:w="60" w:type="dxa"/>
+            </w:tcMar>
+          </w:tcPr>
+          <w:p>
+            <w:r>
+              <w:rPr>
+                <w:rFonts w:ascii="Times New Roman" w:hAnsi="Times New Roman"/>
+                <w:sz w:val="26"/>
+              </w:rPr>
+              <w:t>Admin cập nhật tiêu chí Rubric áp dụng trực tiếp cho AI</w:t>
+            </w:r>
+          </w:p>
+        </w:tc>
+      </w:tr>
+      <w:tr>
+        <w:tc>
+          <w:tcPr>
+            <w:tcW w:type="dxa" w:w="1584"/>
+            <w:shd w:fill="F9EBEA"/>
+            <w:tcMar>
+              <w:top w:w="60" w:type="dxa"/>
+              <w:bottom w:w="60" w:type="dxa"/>
+              <w:left w:w="60" w:type="dxa"/>
+              <w:right w:w="60" w:type="dxa"/>
+            </w:tcMar>
+          </w:tcPr>
+          <w:p>
+            <w:r>
+              <w:rPr>
+                <w:rFonts w:ascii="Times New Roman" w:hAnsi="Times New Roman"/>
+                <w:b/>
+                <w:sz w:val="26"/>
+              </w:rPr>
+              <w:t>POST</w:t>
+            </w:r>
+          </w:p>
+        </w:tc>
+        <w:tc>
+          <w:tcPr>
+            <w:tcW w:type="dxa" w:w="3600"/>
+            <w:shd w:fill="F9EBEA"/>
+            <w:tcMar>
+              <w:top w:w="60" w:type="dxa"/>
+              <w:bottom w:w="60" w:type="dxa"/>
+              <w:left w:w="60" w:type="dxa"/>
+              <w:right w:w="60" w:type="dxa"/>
+            </w:tcMar>
+          </w:tcPr>
+          <w:p>
+            <w:r>
+              <w:rPr>
+                <w:rFonts w:ascii="Times New Roman" w:hAnsi="Times New Roman"/>
+                <w:sz w:val="26"/>
+              </w:rPr>
+              <w:t>/api/rubrics/reset</w:t>
+            </w:r>
+          </w:p>
+        </w:tc>
+        <w:tc>
+          <w:tcPr>
+            <w:tcW w:type="dxa" w:w="1728"/>
+            <w:shd w:fill="F9EBEA"/>
+            <w:tcMar>
+              <w:top w:w="60" w:type="dxa"/>
+              <w:bottom w:w="60" w:type="dxa"/>
+              <w:left w:w="60" w:type="dxa"/>
+              <w:right w:w="60" w:type="dxa"/>
+            </w:tcMar>
+          </w:tcPr>
+          <w:p>
+            <w:r>
+              <w:rPr>
+                <w:rFonts w:ascii="Times New Roman" w:hAnsi="Times New Roman"/>
+                <w:sz w:val="26"/>
+              </w:rPr>
+              <w:t>Admin</w:t>
+            </w:r>
+          </w:p>
+        </w:tc>
+        <w:tc>
+          <w:tcPr>
+            <w:tcW w:type="dxa" w:w="2880"/>
+            <w:shd w:fill="F9EBEA"/>
+            <w:tcMar>
+              <w:top w:w="60" w:type="dxa"/>
+              <w:bottom w:w="60" w:type="dxa"/>
+              <w:left w:w="60" w:type="dxa"/>
+              <w:right w:w="60" w:type="dxa"/>
+            </w:tcMar>
+          </w:tcPr>
+          <w:p>
+            <w:r>
+              <w:rPr>
+                <w:rFonts w:ascii="Times New Roman" w:hAnsi="Times New Roman"/>
+                <w:sz w:val="26"/>
+              </w:rPr>
+              <w:t>Reset dữ liệu Rubric về chuẩn IELTS Cambridge</w:t>
+            </w:r>
+          </w:p>
+        </w:tc>
+      </w:tr>
+      <w:tr>
+        <w:tc>
+          <w:tcPr>
+            <w:tcW w:type="dxa" w:w="1584"/>
+            <w:shd w:fill="F4F6F7"/>
+            <w:tcMar>
+              <w:top w:w="60" w:type="dxa"/>
+              <w:bottom w:w="60" w:type="dxa"/>
+              <w:left w:w="60" w:type="dxa"/>
+              <w:right w:w="60" w:type="dxa"/>
+            </w:tcMar>
+          </w:tcPr>
+          <w:p>
+            <w:r>
+              <w:rPr>
+                <w:rFonts w:ascii="Times New Roman" w:hAnsi="Times New Roman"/>
+                <w:b/>
+                <w:sz w:val="26"/>
+              </w:rPr>
+              <w:t>POST</w:t>
+            </w:r>
+          </w:p>
+        </w:tc>
+        <w:tc>
+          <w:tcPr>
+            <w:tcW w:type="dxa" w:w="3600"/>
+            <w:shd w:fill="F4F6F7"/>
+            <w:tcMar>
+              <w:top w:w="60" w:type="dxa"/>
+              <w:bottom w:w="60" w:type="dxa"/>
+              <w:left w:w="60" w:type="dxa"/>
+              <w:right w:w="60" w:type="dxa"/>
+            </w:tcMar>
+          </w:tcPr>
+          <w:p>
+            <w:r>
+              <w:rPr>
+                <w:rFonts w:ascii="Times New Roman" w:hAnsi="Times New Roman"/>
+                <w:sz w:val="26"/>
+              </w:rPr>
+              <w:t>/api/submissions</w:t>
+            </w:r>
+          </w:p>
+        </w:tc>
+        <w:tc>
+          <w:tcPr>
+            <w:tcW w:type="dxa" w:w="1728"/>
+            <w:shd w:fill="F4F6F7"/>
+            <w:tcMar>
+              <w:top w:w="60" w:type="dxa"/>
+              <w:bottom w:w="60" w:type="dxa"/>
+              <w:left w:w="60" w:type="dxa"/>
+              <w:right w:w="60" w:type="dxa"/>
+            </w:tcMar>
+          </w:tcPr>
+          <w:p>
+            <w:r>
+              <w:rPr>
+                <w:rFonts w:ascii="Times New Roman" w:hAnsi="Times New Roman"/>
+                <w:sz w:val="26"/>
+              </w:rPr>
+              <w:t>Student</w:t>
+            </w:r>
+          </w:p>
+        </w:tc>
+        <w:tc>
+          <w:tcPr>
+            <w:tcW w:type="dxa" w:w="2880"/>
+            <w:shd w:fill="F4F6F7"/>
+            <w:tcMar>
+              <w:top w:w="60" w:type="dxa"/>
+              <w:bottom w:w="60" w:type="dxa"/>
+              <w:left w:w="60" w:type="dxa"/>
+              <w:right w:w="60" w:type="dxa"/>
+            </w:tcMar>
+          </w:tcPr>
+          <w:p>
+            <w:r>
+              <w:rPr>
+                <w:rFonts w:ascii="Times New Roman" w:hAnsi="Times New Roman"/>
+                <w:sz w:val="26"/>
+              </w:rPr>
+              <w:t>Lưu thủ công bản ghi bài nộp vào CSDL</w:t>
+            </w:r>
+          </w:p>
+        </w:tc>
+      </w:tr>
+      <w:tr>
+        <w:tc>
+          <w:tcPr>
+            <w:tcW w:type="dxa" w:w="1584"/>
+            <w:shd w:fill="F9EBEA"/>
+            <w:tcMar>
+              <w:top w:w="60" w:type="dxa"/>
+              <w:bottom w:w="60" w:type="dxa"/>
+              <w:left w:w="60" w:type="dxa"/>
+              <w:right w:w="60" w:type="dxa"/>
+            </w:tcMar>
+          </w:tcPr>
+          <w:p>
+            <w:r>
+              <w:rPr>
+                <w:rFonts w:ascii="Times New Roman" w:hAnsi="Times New Roman"/>
+                <w:b/>
+                <w:sz w:val="26"/>
+              </w:rPr>
+              <w:t>GET</w:t>
+            </w:r>
+          </w:p>
+        </w:tc>
+        <w:tc>
+          <w:tcPr>
+            <w:tcW w:type="dxa" w:w="3600"/>
+            <w:shd w:fill="F9EBEA"/>
+            <w:tcMar>
+              <w:top w:w="60" w:type="dxa"/>
+              <w:bottom w:w="60" w:type="dxa"/>
+              <w:left w:w="60" w:type="dxa"/>
+              <w:right w:w="60" w:type="dxa"/>
+            </w:tcMar>
+          </w:tcPr>
+          <w:p>
+            <w:r>
+              <w:rPr>
+                <w:rFonts w:ascii="Times New Roman" w:hAnsi="Times New Roman"/>
+                <w:sz w:val="26"/>
+              </w:rPr>
+              <w:t>/api/submissions</w:t>
+            </w:r>
+          </w:p>
+        </w:tc>
+        <w:tc>
+          <w:tcPr>
+            <w:tcW w:type="dxa" w:w="1728"/>
+            <w:shd w:fill="F9EBEA"/>
+            <w:tcMar>
+              <w:top w:w="60" w:type="dxa"/>
+              <w:bottom w:w="60" w:type="dxa"/>
+              <w:left w:w="60" w:type="dxa"/>
+              <w:right w:w="60" w:type="dxa"/>
+            </w:tcMar>
+          </w:tcPr>
+          <w:p>
+            <w:r>
+              <w:rPr>
+                <w:rFonts w:ascii="Times New Roman" w:hAnsi="Times New Roman"/>
+                <w:sz w:val="26"/>
+              </w:rPr>
+              <w:t>Authenticated</w:t>
+            </w:r>
+          </w:p>
+        </w:tc>
+        <w:tc>
+          <w:tcPr>
+            <w:tcW w:type="dxa" w:w="2880"/>
+            <w:shd w:fill="F9EBEA"/>
+            <w:tcMar>
+              <w:top w:w="60" w:type="dxa"/>
+              <w:bottom w:w="60" w:type="dxa"/>
+              <w:left w:w="60" w:type="dxa"/>
+              <w:right w:w="60" w:type="dxa"/>
+            </w:tcMar>
+          </w:tcPr>
+          <w:p>
+            <w:r>
+              <w:rPr>
+                <w:rFonts w:ascii="Times New Roman" w:hAnsi="Times New Roman"/>
+                <w:sz w:val="26"/>
+              </w:rPr>
+              <w:t>Lấy lịch sử tất cả bài nộp của học viên</w:t>
+            </w:r>
+          </w:p>
+        </w:tc>
+      </w:tr>
+      <w:tr>
+        <w:tc>
+          <w:tcPr>
+            <w:tcW w:type="dxa" w:w="1584"/>
+            <w:shd w:fill="F4F6F7"/>
+            <w:tcMar>
+              <w:top w:w="60" w:type="dxa"/>
+              <w:bottom w:w="60" w:type="dxa"/>
+              <w:left w:w="60" w:type="dxa"/>
+              <w:right w:w="60" w:type="dxa"/>
+            </w:tcMar>
+          </w:tcPr>
+          <w:p>
+            <w:r>
+              <w:rPr>
+                <w:rFonts w:ascii="Times New Roman" w:hAnsi="Times New Roman"/>
+                <w:b/>
+                <w:sz w:val="26"/>
+              </w:rPr>
+              <w:t>GET</w:t>
+            </w:r>
+          </w:p>
+        </w:tc>
+        <w:tc>
+          <w:tcPr>
+            <w:tcW w:type="dxa" w:w="3600"/>
+            <w:shd w:fill="F4F6F7"/>
+            <w:tcMar>
+              <w:top w:w="60" w:type="dxa"/>
+              <w:bottom w:w="60" w:type="dxa"/>
+              <w:left w:w="60" w:type="dxa"/>
+              <w:right w:w="60" w:type="dxa"/>
+            </w:tcMar>
+          </w:tcPr>
+          <w:p>
+            <w:r>
+              <w:rPr>
+                <w:rFonts w:ascii="Times New Roman" w:hAnsi="Times New Roman"/>
+                <w:sz w:val="26"/>
+              </w:rPr>
+              <w:t>/api/submissions/progress-analytics</w:t>
+            </w:r>
+          </w:p>
+        </w:tc>
+        <w:tc>
+          <w:tcPr>
+            <w:tcW w:type="dxa" w:w="1728"/>
+            <w:shd w:fill="F4F6F7"/>
+            <w:tcMar>
+              <w:top w:w="60" w:type="dxa"/>
+              <w:bottom w:w="60" w:type="dxa"/>
+              <w:left w:w="60" w:type="dxa"/>
+              <w:right w:w="60" w:type="dxa"/>
+            </w:tcMar>
+          </w:tcPr>
+          <w:p>
+            <w:r>
+              <w:rPr>
+                <w:rFonts w:ascii="Times New Roman" w:hAnsi="Times New Roman"/>
+                <w:sz w:val="26"/>
+              </w:rPr>
+              <w:t>Student</w:t>
+            </w:r>
+          </w:p>
+        </w:tc>
+        <w:tc>
+          <w:tcPr>
+            <w:tcW w:type="dxa" w:w="2880"/>
+            <w:shd w:fill="F4F6F7"/>
+            <w:tcMar>
+              <w:top w:w="60" w:type="dxa"/>
+              <w:bottom w:w="60" w:type="dxa"/>
+              <w:left w:w="60" w:type="dxa"/>
+              <w:right w:w="60" w:type="dxa"/>
+            </w:tcMar>
+          </w:tcPr>
+          <w:p>
+            <w:r>
+              <w:rPr>
+                <w:rFonts w:ascii="Times New Roman" w:hAnsi="Times New Roman"/>
+                <w:sz w:val="26"/>
+              </w:rPr>
+              <w:t>Lấy dữ liệu đồ thị di động 4 tiêu chí cho Recharts</w:t>
+            </w:r>
+          </w:p>
+        </w:tc>
+      </w:tr>
+      <w:tr>
+        <w:tc>
+          <w:tcPr>
+            <w:tcW w:type="dxa" w:w="1584"/>
+            <w:shd w:fill="F9EBEA"/>
+            <w:tcMar>
+              <w:top w:w="60" w:type="dxa"/>
+              <w:bottom w:w="60" w:type="dxa"/>
+              <w:left w:w="60" w:type="dxa"/>
+              <w:right w:w="60" w:type="dxa"/>
+            </w:tcMar>
+          </w:tcPr>
+          <w:p>
+            <w:r>
+              <w:rPr>
+                <w:rFonts w:ascii="Times New Roman" w:hAnsi="Times New Roman"/>
+                <w:b/>
+                <w:sz w:val="26"/>
+              </w:rPr>
+              <w:t>GET</w:t>
+            </w:r>
+          </w:p>
+        </w:tc>
+        <w:tc>
+          <w:tcPr>
+            <w:tcW w:type="dxa" w:w="3600"/>
+            <w:shd w:fill="F9EBEA"/>
+            <w:tcMar>
+              <w:top w:w="60" w:type="dxa"/>
+              <w:bottom w:w="60" w:type="dxa"/>
+              <w:left w:w="60" w:type="dxa"/>
+              <w:right w:w="60" w:type="dxa"/>
+            </w:tcMar>
+          </w:tcPr>
+          <w:p>
+            <w:r>
+              <w:rPr>
+                <w:rFonts w:ascii="Times New Roman" w:hAnsi="Times New Roman"/>
+                <w:sz w:val="26"/>
+              </w:rPr>
+              <w:t>/api/lectures</w:t>
+            </w:r>
+          </w:p>
+        </w:tc>
+        <w:tc>
+          <w:tcPr>
+            <w:tcW w:type="dxa" w:w="1728"/>
+            <w:shd w:fill="F9EBEA"/>
+            <w:tcMar>
+              <w:top w:w="60" w:type="dxa"/>
+              <w:bottom w:w="60" w:type="dxa"/>
+              <w:left w:w="60" w:type="dxa"/>
+              <w:right w:w="60" w:type="dxa"/>
+            </w:tcMar>
+          </w:tcPr>
+          <w:p>
+            <w:r>
+              <w:rPr>
+                <w:rFonts w:ascii="Times New Roman" w:hAnsi="Times New Roman"/>
+                <w:sz w:val="26"/>
+              </w:rPr>
+              <w:t>Authenticated</w:t>
+            </w:r>
+          </w:p>
+        </w:tc>
+        <w:tc>
+          <w:tcPr>
+            <w:tcW w:type="dxa" w:w="2880"/>
+            <w:shd w:fill="F9EBEA"/>
+            <w:tcMar>
+              <w:top w:w="60" w:type="dxa"/>
+              <w:bottom w:w="60" w:type="dxa"/>
+              <w:left w:w="60" w:type="dxa"/>
+              <w:right w:w="60" w:type="dxa"/>
+            </w:tcMar>
+          </w:tcPr>
+          <w:p>
+            <w:r>
+              <w:rPr>
+                <w:rFonts w:ascii="Times New Roman" w:hAnsi="Times New Roman"/>
+                <w:sz w:val="26"/>
+              </w:rPr>
+              <w:t>Lấy danh sách bài giảng lý thuyết theo targetGroup</w:t>
+            </w:r>
+          </w:p>
+        </w:tc>
+      </w:tr>
+      <w:tr>
+        <w:tc>
+          <w:tcPr>
+            <w:tcW w:type="dxa" w:w="1584"/>
+            <w:shd w:fill="F4F6F7"/>
+            <w:tcMar>
+              <w:top w:w="60" w:type="dxa"/>
+              <w:bottom w:w="60" w:type="dxa"/>
+              <w:left w:w="60" w:type="dxa"/>
+              <w:right w:w="60" w:type="dxa"/>
+            </w:tcMar>
+          </w:tcPr>
+          <w:p>
+            <w:r>
+              <w:rPr>
+                <w:rFonts w:ascii="Times New Roman" w:hAnsi="Times New Roman"/>
+                <w:b/>
+                <w:sz w:val="26"/>
+              </w:rPr>
+              <w:t>GET</w:t>
+            </w:r>
+          </w:p>
+        </w:tc>
+        <w:tc>
+          <w:tcPr>
+            <w:tcW w:type="dxa" w:w="3600"/>
+            <w:shd w:fill="F4F6F7"/>
+            <w:tcMar>
+              <w:top w:w="60" w:type="dxa"/>
+              <w:bottom w:w="60" w:type="dxa"/>
+              <w:left w:w="60" w:type="dxa"/>
+              <w:right w:w="60" w:type="dxa"/>
+            </w:tcMar>
+          </w:tcPr>
+          <w:p>
+            <w:r>
+              <w:rPr>
+                <w:rFonts w:ascii="Times New Roman" w:hAnsi="Times New Roman"/>
+                <w:sz w:val="26"/>
+              </w:rPr>
+              <w:t>/api/lectures/:id</w:t>
+            </w:r>
+          </w:p>
+        </w:tc>
+        <w:tc>
+          <w:tcPr>
+            <w:tcW w:type="dxa" w:w="1728"/>
+            <w:shd w:fill="F4F6F7"/>
+            <w:tcMar>
+              <w:top w:w="60" w:type="dxa"/>
+              <w:bottom w:w="60" w:type="dxa"/>
+              <w:left w:w="60" w:type="dxa"/>
+              <w:right w:w="60" w:type="dxa"/>
+            </w:tcMar>
+          </w:tcPr>
+          <w:p>
+            <w:r>
+              <w:rPr>
+                <w:rFonts w:ascii="Times New Roman" w:hAnsi="Times New Roman"/>
+                <w:sz w:val="26"/>
+              </w:rPr>
+              <w:t>Authenticated</w:t>
+            </w:r>
+          </w:p>
+        </w:tc>
+        <w:tc>
+          <w:tcPr>
+            <w:tcW w:type="dxa" w:w="2880"/>
+            <w:shd w:fill="F4F6F7"/>
+            <w:tcMar>
+              <w:top w:w="60" w:type="dxa"/>
+              <w:bottom w:w="60" w:type="dxa"/>
+              <w:left w:w="60" w:type="dxa"/>
+              <w:right w:w="60" w:type="dxa"/>
+            </w:tcMar>
+          </w:tcPr>
+          <w:p>
+            <w:r>
+              <w:rPr>
+                <w:rFonts w:ascii="Times New Roman" w:hAnsi="Times New Roman"/>
+                <w:sz w:val="26"/>
+              </w:rPr>
+              <w:t>Lấy nội dung chi tiết 1 bài giảng Markdown</w:t>
+            </w:r>
+          </w:p>
+        </w:tc>
+      </w:tr>
+      <w:tr>
+        <w:tc>
+          <w:tcPr>
+            <w:tcW w:type="dxa" w:w="1584"/>
+            <w:shd w:fill="F9EBEA"/>
+            <w:tcMar>
+              <w:top w:w="60" w:type="dxa"/>
+              <w:bottom w:w="60" w:type="dxa"/>
+              <w:left w:w="60" w:type="dxa"/>
+              <w:right w:w="60" w:type="dxa"/>
+            </w:tcMar>
+          </w:tcPr>
+          <w:p>
+            <w:r>
+              <w:rPr>
+                <w:rFonts w:ascii="Times New Roman" w:hAnsi="Times New Roman"/>
+                <w:b/>
+                <w:sz w:val="26"/>
+              </w:rPr>
+              <w:t>POST</w:t>
+            </w:r>
+          </w:p>
+        </w:tc>
+        <w:tc>
+          <w:tcPr>
+            <w:tcW w:type="dxa" w:w="3600"/>
+            <w:shd w:fill="F9EBEA"/>
+            <w:tcMar>
+              <w:top w:w="60" w:type="dxa"/>
+              <w:bottom w:w="60" w:type="dxa"/>
+              <w:left w:w="60" w:type="dxa"/>
+              <w:right w:w="60" w:type="dxa"/>
+            </w:tcMar>
+          </w:tcPr>
+          <w:p>
+            <w:r>
+              <w:rPr>
+                <w:rFonts w:ascii="Times New Roman" w:hAnsi="Times New Roman"/>
+                <w:sz w:val="26"/>
+              </w:rPr>
+              <w:t>/api/lectures</w:t>
+            </w:r>
+          </w:p>
+        </w:tc>
+        <w:tc>
+          <w:tcPr>
+            <w:tcW w:type="dxa" w:w="1728"/>
+            <w:shd w:fill="F9EBEA"/>
+            <w:tcMar>
+              <w:top w:w="60" w:type="dxa"/>
+              <w:bottom w:w="60" w:type="dxa"/>
+              <w:left w:w="60" w:type="dxa"/>
+              <w:right w:w="60" w:type="dxa"/>
+            </w:tcMar>
+          </w:tcPr>
+          <w:p>
+            <w:r>
+              <w:rPr>
+                <w:rFonts w:ascii="Times New Roman" w:hAnsi="Times New Roman"/>
+                <w:sz w:val="26"/>
+              </w:rPr>
+              <w:t>Admin</w:t>
+            </w:r>
+          </w:p>
+        </w:tc>
+        <w:tc>
+          <w:tcPr>
+            <w:tcW w:type="dxa" w:w="2880"/>
+            <w:shd w:fill="F9EBEA"/>
+            <w:tcMar>
+              <w:top w:w="60" w:type="dxa"/>
+              <w:bottom w:w="60" w:type="dxa"/>
+              <w:left w:w="60" w:type="dxa"/>
+              <w:right w:w="60" w:type="dxa"/>
+            </w:tcMar>
+          </w:tcPr>
+          <w:p>
+            <w:r>
+              <w:rPr>
+                <w:rFonts w:ascii="Times New Roman" w:hAnsi="Times New Roman"/>
+                <w:sz w:val="26"/>
+              </w:rPr>
+              <w:t>Tạo bài giảng lý thuyết mới</w:t>
+            </w:r>
+          </w:p>
+        </w:tc>
+      </w:tr>
+      <w:tr>
+        <w:tc>
+          <w:tcPr>
+            <w:tcW w:type="dxa" w:w="1584"/>
+            <w:shd w:fill="F4F6F7"/>
+            <w:tcMar>
+              <w:top w:w="60" w:type="dxa"/>
+              <w:bottom w:w="60" w:type="dxa"/>
+              <w:left w:w="60" w:type="dxa"/>
+              <w:right w:w="60" w:type="dxa"/>
+            </w:tcMar>
+          </w:tcPr>
+          <w:p>
+            <w:r>
+              <w:rPr>
+                <w:rFonts w:ascii="Times New Roman" w:hAnsi="Times New Roman"/>
+                <w:b/>
+                <w:sz w:val="26"/>
+              </w:rPr>
+              <w:t>PUT</w:t>
+            </w:r>
+          </w:p>
+        </w:tc>
+        <w:tc>
+          <w:tcPr>
+            <w:tcW w:type="dxa" w:w="3600"/>
+            <w:shd w:fill="F4F6F7"/>
+            <w:tcMar>
+              <w:top w:w="60" w:type="dxa"/>
+              <w:bottom w:w="60" w:type="dxa"/>
+              <w:left w:w="60" w:type="dxa"/>
+              <w:right w:w="60" w:type="dxa"/>
+            </w:tcMar>
+          </w:tcPr>
+          <w:p>
+            <w:r>
+              <w:rPr>
+                <w:rFonts w:ascii="Times New Roman" w:hAnsi="Times New Roman"/>
+                <w:sz w:val="26"/>
+              </w:rPr>
+              <w:t>/api/lectures/:id</w:t>
+            </w:r>
+          </w:p>
+        </w:tc>
+        <w:tc>
+          <w:tcPr>
+            <w:tcW w:type="dxa" w:w="1728"/>
+            <w:shd w:fill="F4F6F7"/>
+            <w:tcMar>
+              <w:top w:w="60" w:type="dxa"/>
+              <w:bottom w:w="60" w:type="dxa"/>
+              <w:left w:w="60" w:type="dxa"/>
+              <w:right w:w="60" w:type="dxa"/>
+            </w:tcMar>
+          </w:tcPr>
+          <w:p>
+            <w:r>
+              <w:rPr>
+                <w:rFonts w:ascii="Times New Roman" w:hAnsi="Times New Roman"/>
+                <w:sz w:val="26"/>
+              </w:rPr>
+              <w:t>Admin</w:t>
+            </w:r>
+          </w:p>
+        </w:tc>
+        <w:tc>
+          <w:tcPr>
+            <w:tcW w:type="dxa" w:w="2880"/>
+            <w:shd w:fill="F4F6F7"/>
+            <w:tcMar>
+              <w:top w:w="60" w:type="dxa"/>
+              <w:bottom w:w="60" w:type="dxa"/>
+              <w:left w:w="60" w:type="dxa"/>
+              <w:right w:w="60" w:type="dxa"/>
+            </w:tcMar>
+          </w:tcPr>
+          <w:p>
+            <w:r>
+              <w:rPr>
+                <w:rFonts w:ascii="Times New Roman" w:hAnsi="Times New Roman"/>
+                <w:sz w:val="26"/>
+              </w:rPr>
+              <w:t>Chỉnh sửa bài giảng lý thuyết</w:t>
+            </w:r>
+          </w:p>
+        </w:tc>
+      </w:tr>
+      <w:tr>
+        <w:tc>
+          <w:tcPr>
+            <w:tcW w:type="dxa" w:w="1584"/>
+            <w:shd w:fill="F9EBEA"/>
+            <w:tcMar>
+              <w:top w:w="60" w:type="dxa"/>
+              <w:bottom w:w="60" w:type="dxa"/>
+              <w:left w:w="60" w:type="dxa"/>
+              <w:right w:w="60" w:type="dxa"/>
+            </w:tcMar>
+          </w:tcPr>
+          <w:p>
+            <w:r>
+              <w:rPr>
+                <w:rFonts w:ascii="Times New Roman" w:hAnsi="Times New Roman"/>
+                <w:b/>
+                <w:sz w:val="26"/>
+              </w:rPr>
+              <w:t>DELETE</w:t>
+            </w:r>
+          </w:p>
+        </w:tc>
+        <w:tc>
+          <w:tcPr>
+            <w:tcW w:type="dxa" w:w="3600"/>
+            <w:shd w:fill="F9EBEA"/>
+            <w:tcMar>
+              <w:top w:w="60" w:type="dxa"/>
+              <w:bottom w:w="60" w:type="dxa"/>
+              <w:left w:w="60" w:type="dxa"/>
+              <w:right w:w="60" w:type="dxa"/>
+            </w:tcMar>
+          </w:tcPr>
+          <w:p>
+            <w:r>
+              <w:rPr>
+                <w:rFonts w:ascii="Times New Roman" w:hAnsi="Times New Roman"/>
+                <w:sz w:val="26"/>
+              </w:rPr>
+              <w:t>/api/lectures/:id</w:t>
+            </w:r>
+          </w:p>
+        </w:tc>
+        <w:tc>
+          <w:tcPr>
+            <w:tcW w:type="dxa" w:w="1728"/>
+            <w:shd w:fill="F9EBEA"/>
+            <w:tcMar>
+              <w:top w:w="60" w:type="dxa"/>
+              <w:bottom w:w="60" w:type="dxa"/>
+              <w:left w:w="60" w:type="dxa"/>
+              <w:right w:w="60" w:type="dxa"/>
+            </w:tcMar>
+          </w:tcPr>
+          <w:p>
+            <w:r>
+              <w:rPr>
+                <w:rFonts w:ascii="Times New Roman" w:hAnsi="Times New Roman"/>
+                <w:sz w:val="26"/>
+              </w:rPr>
+              <w:t>Admin</w:t>
+            </w:r>
+          </w:p>
+        </w:tc>
+        <w:tc>
+          <w:tcPr>
+            <w:tcW w:type="dxa" w:w="2880"/>
+            <w:shd w:fill="F9EBEA"/>
+            <w:tcMar>
+              <w:top w:w="60" w:type="dxa"/>
+              <w:bottom w:w="60" w:type="dxa"/>
+              <w:left w:w="60" w:type="dxa"/>
+              <w:right w:w="60" w:type="dxa"/>
+            </w:tcMar>
+          </w:tcPr>
+          <w:p>
+            <w:r>
+              <w:rPr>
+                <w:rFonts w:ascii="Times New Roman" w:hAnsi="Times New Roman"/>
+                <w:sz w:val="26"/>
+              </w:rPr>
+              <w:t>Xóa bài giảng lý thuyết</w:t>
+            </w:r>
+          </w:p>
+        </w:tc>
+      </w:tr>
+      <w:tr>
+        <w:tc>
+          <w:tcPr>
+            <w:tcW w:type="dxa" w:w="1584"/>
+            <w:shd w:fill="F4F6F7"/>
+            <w:tcMar>
+              <w:top w:w="60" w:type="dxa"/>
+              <w:bottom w:w="60" w:type="dxa"/>
+              <w:left w:w="60" w:type="dxa"/>
+              <w:right w:w="60" w:type="dxa"/>
+            </w:tcMar>
+          </w:tcPr>
+          <w:p>
+            <w:r>
+              <w:rPr>
+                <w:rFonts w:ascii="Times New Roman" w:hAnsi="Times New Roman"/>
+                <w:b/>
+                <w:sz w:val="26"/>
+              </w:rPr>
+              <w:t>POST</w:t>
+            </w:r>
+          </w:p>
+        </w:tc>
+        <w:tc>
+          <w:tcPr>
+            <w:tcW w:type="dxa" w:w="3600"/>
+            <w:shd w:fill="F4F6F7"/>
+            <w:tcMar>
+              <w:top w:w="60" w:type="dxa"/>
+              <w:bottom w:w="60" w:type="dxa"/>
+              <w:left w:w="60" w:type="dxa"/>
+              <w:right w:w="60" w:type="dxa"/>
+            </w:tcMar>
+          </w:tcPr>
+          <w:p>
+            <w:r>
+              <w:rPr>
+                <w:rFonts w:ascii="Times New Roman" w:hAnsi="Times New Roman"/>
+                <w:sz w:val="26"/>
+              </w:rPr>
+              <w:t>/api/lectures/:lectureId/exercises</w:t>
+            </w:r>
+          </w:p>
+        </w:tc>
+        <w:tc>
+          <w:tcPr>
+            <w:tcW w:type="dxa" w:w="1728"/>
+            <w:shd w:fill="F4F6F7"/>
+            <w:tcMar>
+              <w:top w:w="60" w:type="dxa"/>
+              <w:bottom w:w="60" w:type="dxa"/>
+              <w:left w:w="60" w:type="dxa"/>
+              <w:right w:w="60" w:type="dxa"/>
+            </w:tcMar>
+          </w:tcPr>
+          <w:p>
+            <w:r>
+              <w:rPr>
+                <w:rFonts w:ascii="Times New Roman" w:hAnsi="Times New Roman"/>
+                <w:sz w:val="26"/>
+              </w:rPr>
+              <w:t>Admin</w:t>
+            </w:r>
+          </w:p>
+        </w:tc>
+        <w:tc>
+          <w:tcPr>
+            <w:tcW w:type="dxa" w:w="2880"/>
+            <w:shd w:fill="F4F6F7"/>
+            <w:tcMar>
+              <w:top w:w="60" w:type="dxa"/>
+              <w:bottom w:w="60" w:type="dxa"/>
+              <w:left w:w="60" w:type="dxa"/>
+              <w:right w:w="60" w:type="dxa"/>
+            </w:tcMar>
+          </w:tcPr>
+          <w:p>
+            <w:r>
+              <w:rPr>
+                <w:rFonts w:ascii="Times New Roman" w:hAnsi="Times New Roman"/>
+                <w:sz w:val="26"/>
+              </w:rPr>
+              <w:t>Thêm bộ bài tập tương tác DOL Format vào bài giảng</w:t>
+            </w:r>
+          </w:p>
+        </w:tc>
+      </w:tr>
+      <w:tr>
+        <w:tc>
+          <w:tcPr>
+            <w:tcW w:type="dxa" w:w="1584"/>
+            <w:shd w:fill="F9EBEA"/>
+            <w:tcMar>
+              <w:top w:w="60" w:type="dxa"/>
+              <w:bottom w:w="60" w:type="dxa"/>
+              <w:left w:w="60" w:type="dxa"/>
+              <w:right w:w="60" w:type="dxa"/>
+            </w:tcMar>
+          </w:tcPr>
+          <w:p>
+            <w:r>
+              <w:rPr>
+                <w:rFonts w:ascii="Times New Roman" w:hAnsi="Times New Roman"/>
+                <w:b/>
+                <w:sz w:val="26"/>
+              </w:rPr>
+              <w:t>PUT</w:t>
+            </w:r>
+          </w:p>
+        </w:tc>
+        <w:tc>
+          <w:tcPr>
+            <w:tcW w:type="dxa" w:w="3600"/>
+            <w:shd w:fill="F9EBEA"/>
+            <w:tcMar>
+              <w:top w:w="60" w:type="dxa"/>
+              <w:bottom w:w="60" w:type="dxa"/>
+              <w:left w:w="60" w:type="dxa"/>
+              <w:right w:w="60" w:type="dxa"/>
+            </w:tcMar>
+          </w:tcPr>
+          <w:p>
+            <w:r>
+              <w:rPr>
+                <w:rFonts w:ascii="Times New Roman" w:hAnsi="Times New Roman"/>
+                <w:sz w:val="26"/>
+              </w:rPr>
+              <w:t>/api/lectures/exercises/:exerciseId</w:t>
+            </w:r>
+          </w:p>
+        </w:tc>
+        <w:tc>
+          <w:tcPr>
+            <w:tcW w:type="dxa" w:w="1728"/>
+            <w:shd w:fill="F9EBEA"/>
+            <w:tcMar>
+              <w:top w:w="60" w:type="dxa"/>
+              <w:bottom w:w="60" w:type="dxa"/>
+              <w:left w:w="60" w:type="dxa"/>
+              <w:right w:w="60" w:type="dxa"/>
+            </w:tcMar>
+          </w:tcPr>
+          <w:p>
+            <w:r>
+              <w:rPr>
+                <w:rFonts w:ascii="Times New Roman" w:hAnsi="Times New Roman"/>
+                <w:sz w:val="26"/>
+              </w:rPr>
+              <w:t>Admin</w:t>
+            </w:r>
+          </w:p>
+        </w:tc>
+        <w:tc>
+          <w:tcPr>
+            <w:tcW w:type="dxa" w:w="2880"/>
+            <w:shd w:fill="F9EBEA"/>
+            <w:tcMar>
+              <w:top w:w="60" w:type="dxa"/>
+              <w:bottom w:w="60" w:type="dxa"/>
+              <w:left w:w="60" w:type="dxa"/>
+              <w:right w:w="60" w:type="dxa"/>
+            </w:tcMar>
+          </w:tcPr>
+          <w:p>
+            <w:r>
+              <w:rPr>
+                <w:rFonts w:ascii="Times New Roman" w:hAnsi="Times New Roman"/>
+                <w:sz w:val="26"/>
+              </w:rPr>
+              <w:t>Chỉnh sửa bộ bài tập tương tác</w:t>
+            </w:r>
+          </w:p>
+        </w:tc>
+      </w:tr>
+      <w:tr>
+        <w:tc>
+          <w:tcPr>
+            <w:tcW w:type="dxa" w:w="1584"/>
+            <w:shd w:fill="F4F6F7"/>
+            <w:tcMar>
+              <w:top w:w="60" w:type="dxa"/>
+              <w:bottom w:w="60" w:type="dxa"/>
+              <w:left w:w="60" w:type="dxa"/>
+              <w:right w:w="60" w:type="dxa"/>
+            </w:tcMar>
+          </w:tcPr>
+          <w:p>
+            <w:r>
+              <w:rPr>
+                <w:rFonts w:ascii="Times New Roman" w:hAnsi="Times New Roman"/>
+                <w:b/>
+                <w:sz w:val="26"/>
+              </w:rPr>
+              <w:t>DELETE</w:t>
+            </w:r>
+          </w:p>
+        </w:tc>
+        <w:tc>
+          <w:tcPr>
+            <w:tcW w:type="dxa" w:w="3600"/>
+            <w:shd w:fill="F4F6F7"/>
+            <w:tcMar>
+              <w:top w:w="60" w:type="dxa"/>
+              <w:bottom w:w="60" w:type="dxa"/>
+              <w:left w:w="60" w:type="dxa"/>
+              <w:right w:w="60" w:type="dxa"/>
+            </w:tcMar>
+          </w:tcPr>
+          <w:p>
+            <w:r>
+              <w:rPr>
+                <w:rFonts w:ascii="Times New Roman" w:hAnsi="Times New Roman"/>
+                <w:sz w:val="26"/>
+              </w:rPr>
+              <w:t>/api/lectures/exercises/:exerciseId</w:t>
+            </w:r>
+          </w:p>
+        </w:tc>
+        <w:tc>
+          <w:tcPr>
+            <w:tcW w:type="dxa" w:w="1728"/>
+            <w:shd w:fill="F4F6F7"/>
+            <w:tcMar>
+              <w:top w:w="60" w:type="dxa"/>
+              <w:bottom w:w="60" w:type="dxa"/>
+              <w:left w:w="60" w:type="dxa"/>
+              <w:right w:w="60" w:type="dxa"/>
+            </w:tcMar>
+          </w:tcPr>
+          <w:p>
+            <w:r>
+              <w:rPr>
+                <w:rFonts w:ascii="Times New Roman" w:hAnsi="Times New Roman"/>
+                <w:sz w:val="26"/>
+              </w:rPr>
+              <w:t>Admin</w:t>
+            </w:r>
+          </w:p>
+        </w:tc>
+        <w:tc>
+          <w:tcPr>
+            <w:tcW w:type="dxa" w:w="2880"/>
+            <w:shd w:fill="F4F6F7"/>
+            <w:tcMar>
+              <w:top w:w="60" w:type="dxa"/>
+              <w:bottom w:w="60" w:type="dxa"/>
+              <w:left w:w="60" w:type="dxa"/>
+              <w:right w:w="60" w:type="dxa"/>
+            </w:tcMar>
+          </w:tcPr>
+          <w:p>
+            <w:r>
+              <w:rPr>
+                <w:rFonts w:ascii="Times New Roman" w:hAnsi="Times New Roman"/>
+                <w:sz w:val="26"/>
+              </w:rPr>
+              <w:t>Xóa bộ bài tập tương tác</w:t>
+            </w:r>
+          </w:p>
+        </w:tc>
+      </w:tr>
+      <w:tr>
+        <w:tc>
+          <w:tcPr>
+            <w:tcW w:type="dxa" w:w="1584"/>
+            <w:shd w:fill="F9EBEA"/>
+            <w:tcMar>
+              <w:top w:w="60" w:type="dxa"/>
+              <w:bottom w:w="60" w:type="dxa"/>
+              <w:left w:w="60" w:type="dxa"/>
+              <w:right w:w="60" w:type="dxa"/>
+            </w:tcMar>
+          </w:tcPr>
+          <w:p>
+            <w:r>
+              <w:rPr>
+                <w:rFonts w:ascii="Times New Roman" w:hAnsi="Times New Roman"/>
+                <w:b/>
+                <w:sz w:val="26"/>
+              </w:rPr>
+              <w:t>GET</w:t>
+            </w:r>
+          </w:p>
+        </w:tc>
+        <w:tc>
+          <w:tcPr>
+            <w:tcW w:type="dxa" w:w="3600"/>
+            <w:shd w:fill="F9EBEA"/>
+            <w:tcMar>
+              <w:top w:w="60" w:type="dxa"/>
+              <w:bottom w:w="60" w:type="dxa"/>
+              <w:left w:w="60" w:type="dxa"/>
+              <w:right w:w="60" w:type="dxa"/>
+            </w:tcMar>
+          </w:tcPr>
+          <w:p>
+            <w:r>
+              <w:rPr>
+                <w:rFonts w:ascii="Times New Roman" w:hAnsi="Times New Roman"/>
+                <w:sz w:val="26"/>
+              </w:rPr>
+              <w:t>/api/notifications</w:t>
+            </w:r>
+          </w:p>
+        </w:tc>
+        <w:tc>
+          <w:tcPr>
+            <w:tcW w:type="dxa" w:w="1728"/>
+            <w:shd w:fill="F9EBEA"/>
+            <w:tcMar>
+              <w:top w:w="60" w:type="dxa"/>
+              <w:bottom w:w="60" w:type="dxa"/>
+              <w:left w:w="60" w:type="dxa"/>
+              <w:right w:w="60" w:type="dxa"/>
+            </w:tcMar>
+          </w:tcPr>
+          <w:p>
+            <w:r>
+              <w:rPr>
+                <w:rFonts w:ascii="Times New Roman" w:hAnsi="Times New Roman"/>
+                <w:sz w:val="26"/>
+              </w:rPr>
+              <w:t>Authenticated</w:t>
+            </w:r>
+          </w:p>
+        </w:tc>
+        <w:tc>
+          <w:tcPr>
+            <w:tcW w:type="dxa" w:w="2880"/>
+            <w:shd w:fill="F9EBEA"/>
+            <w:tcMar>
+              <w:top w:w="60" w:type="dxa"/>
+              <w:bottom w:w="60" w:type="dxa"/>
+              <w:left w:w="60" w:type="dxa"/>
+              <w:right w:w="60" w:type="dxa"/>
+            </w:tcMar>
+          </w:tcPr>
+          <w:p>
+            <w:r>
+              <w:rPr>
+                <w:rFonts w:ascii="Times New Roman" w:hAnsi="Times New Roman"/>
+                <w:sz w:val="26"/>
+              </w:rPr>
+              <w:t>Lấy danh sách thông báo &amp; đếm chưa đọc (Polling 30s)</w:t>
+            </w:r>
+          </w:p>
+        </w:tc>
+      </w:tr>
+      <w:tr>
+        <w:tc>
+          <w:tcPr>
+            <w:tcW w:type="dxa" w:w="1584"/>
+            <w:shd w:fill="F4F6F7"/>
+            <w:tcMar>
+              <w:top w:w="60" w:type="dxa"/>
+              <w:bottom w:w="60" w:type="dxa"/>
+              <w:left w:w="60" w:type="dxa"/>
+              <w:right w:w="60" w:type="dxa"/>
+            </w:tcMar>
+          </w:tcPr>
+          <w:p>
+            <w:r>
+              <w:rPr>
+                <w:rFonts w:ascii="Times New Roman" w:hAnsi="Times New Roman"/>
+                <w:b/>
+                <w:sz w:val="26"/>
+              </w:rPr>
+              <w:t>PUT</w:t>
+            </w:r>
+          </w:p>
+        </w:tc>
+        <w:tc>
+          <w:tcPr>
+            <w:tcW w:type="dxa" w:w="3600"/>
+            <w:shd w:fill="F4F6F7"/>
+            <w:tcMar>
+              <w:top w:w="60" w:type="dxa"/>
+              <w:bottom w:w="60" w:type="dxa"/>
+              <w:left w:w="60" w:type="dxa"/>
+              <w:right w:w="60" w:type="dxa"/>
+            </w:tcMar>
+          </w:tcPr>
+          <w:p>
+            <w:r>
+              <w:rPr>
+                <w:rFonts w:ascii="Times New Roman" w:hAnsi="Times New Roman"/>
+                <w:sz w:val="26"/>
+              </w:rPr>
+              <w:t>/api/notifications/read-all</w:t>
+            </w:r>
+          </w:p>
+        </w:tc>
+        <w:tc>
+          <w:tcPr>
+            <w:tcW w:type="dxa" w:w="1728"/>
+            <w:shd w:fill="F4F6F7"/>
+            <w:tcMar>
+              <w:top w:w="60" w:type="dxa"/>
+              <w:bottom w:w="60" w:type="dxa"/>
+              <w:left w:w="60" w:type="dxa"/>
+              <w:right w:w="60" w:type="dxa"/>
+            </w:tcMar>
+          </w:tcPr>
+          <w:p>
+            <w:r>
+              <w:rPr>
+                <w:rFonts w:ascii="Times New Roman" w:hAnsi="Times New Roman"/>
+                <w:sz w:val="26"/>
+              </w:rPr>
+              <w:t>Authenticated</w:t>
+            </w:r>
+          </w:p>
+        </w:tc>
+        <w:tc>
+          <w:tcPr>
+            <w:tcW w:type="dxa" w:w="2880"/>
+            <w:shd w:fill="F4F6F7"/>
+            <w:tcMar>
+              <w:top w:w="60" w:type="dxa"/>
+              <w:bottom w:w="60" w:type="dxa"/>
+              <w:left w:w="60" w:type="dxa"/>
+              <w:right w:w="60" w:type="dxa"/>
+            </w:tcMar>
+          </w:tcPr>
+          <w:p>
+            <w:r>
+              <w:rPr>
+                <w:rFonts w:ascii="Times New Roman" w:hAnsi="Times New Roman"/>
+                <w:sz w:val="26"/>
+              </w:rPr>
+              <w:t>Đánh dấu tất cả thông báo là đã đọc</w:t>
+            </w:r>
+          </w:p>
+        </w:tc>
+      </w:tr>
+      <w:tr>
+        <w:tc>
+          <w:tcPr>
+            <w:tcW w:type="dxa" w:w="1584"/>
+            <w:shd w:fill="F9EBEA"/>
+            <w:tcMar>
+              <w:top w:w="60" w:type="dxa"/>
+              <w:bottom w:w="60" w:type="dxa"/>
+              <w:left w:w="60" w:type="dxa"/>
+              <w:right w:w="60" w:type="dxa"/>
+            </w:tcMar>
+          </w:tcPr>
+          <w:p>
+            <w:r>
+              <w:rPr>
+                <w:rFonts w:ascii="Times New Roman" w:hAnsi="Times New Roman"/>
+                <w:b/>
+                <w:sz w:val="26"/>
+              </w:rPr>
+              <w:t>POST</w:t>
+            </w:r>
+          </w:p>
+        </w:tc>
+        <w:tc>
+          <w:tcPr>
+            <w:tcW w:type="dxa" w:w="3600"/>
+            <w:shd w:fill="F9EBEA"/>
+            <w:tcMar>
+              <w:top w:w="60" w:type="dxa"/>
+              <w:bottom w:w="60" w:type="dxa"/>
+              <w:left w:w="60" w:type="dxa"/>
+              <w:right w:w="60" w:type="dxa"/>
+            </w:tcMar>
+          </w:tcPr>
+          <w:p>
+            <w:r>
+              <w:rPr>
+                <w:rFonts w:ascii="Times New Roman" w:hAnsi="Times New Roman"/>
+                <w:sz w:val="26"/>
+              </w:rPr>
+              <w:t>/api/notifications/send-document</w:t>
+            </w:r>
+          </w:p>
+        </w:tc>
+        <w:tc>
+          <w:tcPr>
+            <w:tcW w:type="dxa" w:w="1728"/>
+            <w:shd w:fill="F9EBEA"/>
+            <w:tcMar>
+              <w:top w:w="60" w:type="dxa"/>
+              <w:bottom w:w="60" w:type="dxa"/>
+              <w:left w:w="60" w:type="dxa"/>
+              <w:right w:w="60" w:type="dxa"/>
+            </w:tcMar>
+          </w:tcPr>
+          <w:p>
+            <w:r>
+              <w:rPr>
+                <w:rFonts w:ascii="Times New Roman" w:hAnsi="Times New Roman"/>
+                <w:sz w:val="26"/>
+              </w:rPr>
+              <w:t>Admin</w:t>
+            </w:r>
+          </w:p>
+        </w:tc>
+        <w:tc>
+          <w:tcPr>
+            <w:tcW w:type="dxa" w:w="2880"/>
+            <w:shd w:fill="F9EBEA"/>
+            <w:tcMar>
+              <w:top w:w="60" w:type="dxa"/>
+              <w:bottom w:w="60" w:type="dxa"/>
+              <w:left w:w="60" w:type="dxa"/>
+              <w:right w:w="60" w:type="dxa"/>
+            </w:tcMar>
+          </w:tcPr>
+          <w:p>
+            <w:r>
+              <w:rPr>
+                <w:rFonts w:ascii="Times New Roman" w:hAnsi="Times New Roman"/>
+                <w:sz w:val="26"/>
+              </w:rPr>
+              <w:t>Admin phát tài liệu / thông báo tới học viên</w:t>
+            </w:r>
+          </w:p>
+        </w:tc>
+      </w:tr>
+      <w:tr>
+        <w:tc>
+          <w:tcPr>
+            <w:tcW w:type="dxa" w:w="1584"/>
+            <w:shd w:fill="F4F6F7"/>
+            <w:tcMar>
+              <w:top w:w="60" w:type="dxa"/>
+              <w:bottom w:w="60" w:type="dxa"/>
+              <w:left w:w="60" w:type="dxa"/>
+              <w:right w:w="60" w:type="dxa"/>
+            </w:tcMar>
+          </w:tcPr>
+          <w:p>
+            <w:r>
+              <w:rPr>
+                <w:rFonts w:ascii="Times New Roman" w:hAnsi="Times New Roman"/>
+                <w:b/>
+                <w:sz w:val="26"/>
+              </w:rPr>
+              <w:t>GET</w:t>
+            </w:r>
+          </w:p>
+        </w:tc>
+        <w:tc>
+          <w:tcPr>
+            <w:tcW w:type="dxa" w:w="3600"/>
+            <w:shd w:fill="F4F6F7"/>
+            <w:tcMar>
+              <w:top w:w="60" w:type="dxa"/>
+              <w:bottom w:w="60" w:type="dxa"/>
+              <w:left w:w="60" w:type="dxa"/>
+              <w:right w:w="60" w:type="dxa"/>
+            </w:tcMar>
+          </w:tcPr>
+          <w:p>
+            <w:r>
+              <w:rPr>
+                <w:rFonts w:ascii="Times New Roman" w:hAnsi="Times New Roman"/>
+                <w:sz w:val="26"/>
+              </w:rPr>
+              <w:t>/api/notifications/my-resources</w:t>
+            </w:r>
+          </w:p>
+        </w:tc>
+        <w:tc>
+          <w:tcPr>
+            <w:tcW w:type="dxa" w:w="1728"/>
+            <w:shd w:fill="F4F6F7"/>
+            <w:tcMar>
+              <w:top w:w="60" w:type="dxa"/>
+              <w:bottom w:w="60" w:type="dxa"/>
+              <w:left w:w="60" w:type="dxa"/>
+              <w:right w:w="60" w:type="dxa"/>
+            </w:tcMar>
+          </w:tcPr>
+          <w:p>
+            <w:r>
+              <w:rPr>
+                <w:rFonts w:ascii="Times New Roman" w:hAnsi="Times New Roman"/>
+                <w:sz w:val="26"/>
+              </w:rPr>
+              <w:t>Student</w:t>
+            </w:r>
+          </w:p>
+        </w:tc>
+        <w:tc>
+          <w:tcPr>
+            <w:tcW w:type="dxa" w:w="2880"/>
+            <w:shd w:fill="F4F6F7"/>
+            <w:tcMar>
+              <w:top w:w="60" w:type="dxa"/>
+              <w:bottom w:w="60" w:type="dxa"/>
+              <w:left w:w="60" w:type="dxa"/>
+              <w:right w:w="60" w:type="dxa"/>
+            </w:tcMar>
+          </w:tcPr>
+          <w:p>
+            <w:r>
+              <w:rPr>
+                <w:rFonts w:ascii="Times New Roman" w:hAnsi="Times New Roman"/>
+                <w:sz w:val="26"/>
+              </w:rPr>
+              <w:t>Lấy danh sách kho tài liệu học tập của học viên</w:t>
+            </w:r>
+          </w:p>
+        </w:tc>
+      </w:tr>
+      <w:tr>
+        <w:tc>
+          <w:tcPr>
+            <w:tcW w:type="dxa" w:w="1584"/>
+            <w:shd w:fill="F9EBEA"/>
+            <w:tcMar>
+              <w:top w:w="60" w:type="dxa"/>
+              <w:bottom w:w="60" w:type="dxa"/>
+              <w:left w:w="60" w:type="dxa"/>
+              <w:right w:w="60" w:type="dxa"/>
+            </w:tcMar>
+          </w:tcPr>
+          <w:p>
+            <w:r>
+              <w:rPr>
+                <w:rFonts w:ascii="Times New Roman" w:hAnsi="Times New Roman"/>
+                <w:b/>
+                <w:sz w:val="26"/>
+              </w:rPr>
+              <w:t>GET</w:t>
+            </w:r>
+          </w:p>
+        </w:tc>
+        <w:tc>
+          <w:tcPr>
+            <w:tcW w:type="dxa" w:w="3600"/>
+            <w:shd w:fill="F9EBEA"/>
+            <w:tcMar>
+              <w:top w:w="60" w:type="dxa"/>
+              <w:bottom w:w="60" w:type="dxa"/>
+              <w:left w:w="60" w:type="dxa"/>
+              <w:right w:w="60" w:type="dxa"/>
+            </w:tcMar>
+          </w:tcPr>
+          <w:p>
+            <w:r>
+              <w:rPr>
+                <w:rFonts w:ascii="Times New Roman" w:hAnsi="Times New Roman"/>
+                <w:sz w:val="26"/>
+              </w:rPr>
+              <w:t>/api/notifications/my-resources/:id</w:t>
+            </w:r>
+          </w:p>
+        </w:tc>
+        <w:tc>
+          <w:tcPr>
+            <w:tcW w:type="dxa" w:w="1728"/>
+            <w:shd w:fill="F9EBEA"/>
+            <w:tcMar>
+              <w:top w:w="60" w:type="dxa"/>
+              <w:bottom w:w="60" w:type="dxa"/>
+              <w:left w:w="60" w:type="dxa"/>
+              <w:right w:w="60" w:type="dxa"/>
+            </w:tcMar>
+          </w:tcPr>
+          <w:p>
+            <w:r>
+              <w:rPr>
+                <w:rFonts w:ascii="Times New Roman" w:hAnsi="Times New Roman"/>
+                <w:sz w:val="26"/>
+              </w:rPr>
+              <w:t>Student</w:t>
+            </w:r>
+          </w:p>
+        </w:tc>
+        <w:tc>
+          <w:tcPr>
+            <w:tcW w:type="dxa" w:w="2880"/>
+            <w:shd w:fill="F9EBEA"/>
+            <w:tcMar>
+              <w:top w:w="60" w:type="dxa"/>
+              <w:bottom w:w="60" w:type="dxa"/>
+              <w:left w:w="60" w:type="dxa"/>
+              <w:right w:w="60" w:type="dxa"/>
+            </w:tcMar>
+          </w:tcPr>
+          <w:p>
+            <w:r>
+              <w:rPr>
+                <w:rFonts w:ascii="Times New Roman" w:hAnsi="Times New Roman"/>
+                <w:sz w:val="26"/>
+              </w:rPr>
+              <w:t>Lấy chi tiết 1 tài liệu trong kho học viên</w:t>
+            </w:r>
+          </w:p>
+        </w:tc>
+      </w:tr>
+      <w:tr>
+        <w:tc>
+          <w:tcPr>
+            <w:tcW w:type="dxa" w:w="1584"/>
+            <w:shd w:fill="F4F6F7"/>
+            <w:tcMar>
+              <w:top w:w="60" w:type="dxa"/>
+              <w:bottom w:w="60" w:type="dxa"/>
+              <w:left w:w="60" w:type="dxa"/>
+              <w:right w:w="60" w:type="dxa"/>
+            </w:tcMar>
+          </w:tcPr>
+          <w:p>
+            <w:r>
+              <w:rPr>
+                <w:rFonts w:ascii="Times New Roman" w:hAnsi="Times New Roman"/>
+                <w:b/>
+                <w:sz w:val="26"/>
+              </w:rPr>
+              <w:t>GET</w:t>
+            </w:r>
+          </w:p>
+        </w:tc>
+        <w:tc>
+          <w:tcPr>
+            <w:tcW w:type="dxa" w:w="3600"/>
+            <w:shd w:fill="F4F6F7"/>
+            <w:tcMar>
+              <w:top w:w="60" w:type="dxa"/>
+              <w:bottom w:w="60" w:type="dxa"/>
+              <w:left w:w="60" w:type="dxa"/>
+              <w:right w:w="60" w:type="dxa"/>
+            </w:tcMar>
+          </w:tcPr>
+          <w:p>
+            <w:r>
+              <w:rPr>
+                <w:rFonts w:ascii="Times New Roman" w:hAnsi="Times New Roman"/>
+                <w:sz w:val="26"/>
+              </w:rPr>
+              <w:t>/api/resources</w:t>
+            </w:r>
+          </w:p>
+        </w:tc>
+        <w:tc>
+          <w:tcPr>
+            <w:tcW w:type="dxa" w:w="1728"/>
+            <w:shd w:fill="F4F6F7"/>
+            <w:tcMar>
+              <w:top w:w="60" w:type="dxa"/>
+              <w:bottom w:w="60" w:type="dxa"/>
+              <w:left w:w="60" w:type="dxa"/>
+              <w:right w:w="60" w:type="dxa"/>
+            </w:tcMar>
+          </w:tcPr>
+          <w:p>
+            <w:r>
+              <w:rPr>
+                <w:rFonts w:ascii="Times New Roman" w:hAnsi="Times New Roman"/>
+                <w:sz w:val="26"/>
+              </w:rPr>
+              <w:t>Admin</w:t>
+            </w:r>
+          </w:p>
+        </w:tc>
+        <w:tc>
+          <w:tcPr>
+            <w:tcW w:type="dxa" w:w="2880"/>
+            <w:shd w:fill="F4F6F7"/>
+            <w:tcMar>
+              <w:top w:w="60" w:type="dxa"/>
+              <w:bottom w:w="60" w:type="dxa"/>
+              <w:left w:w="60" w:type="dxa"/>
+              <w:right w:w="60" w:type="dxa"/>
+            </w:tcMar>
+          </w:tcPr>
+          <w:p>
+            <w:r>
+              <w:rPr>
+                <w:rFonts w:ascii="Times New Roman" w:hAnsi="Times New Roman"/>
+                <w:sz w:val="26"/>
+              </w:rPr>
+              <w:t>Admin xem tất cả tài liệu trong kho lưu trữ</w:t>
+            </w:r>
+          </w:p>
+        </w:tc>
+      </w:tr>
+      <w:tr>
+        <w:tc>
+          <w:tcPr>
+            <w:tcW w:type="dxa" w:w="1584"/>
+            <w:shd w:fill="F9EBEA"/>
+            <w:tcMar>
+              <w:top w:w="60" w:type="dxa"/>
+              <w:bottom w:w="60" w:type="dxa"/>
+              <w:left w:w="60" w:type="dxa"/>
+              <w:right w:w="60" w:type="dxa"/>
+            </w:tcMar>
+          </w:tcPr>
+          <w:p>
+            <w:r>
+              <w:rPr>
+                <w:rFonts w:ascii="Times New Roman" w:hAnsi="Times New Roman"/>
+                <w:b/>
+                <w:sz w:val="26"/>
+              </w:rPr>
+              <w:t>POST</w:t>
+            </w:r>
+          </w:p>
+        </w:tc>
+        <w:tc>
+          <w:tcPr>
+            <w:tcW w:type="dxa" w:w="3600"/>
+            <w:shd w:fill="F9EBEA"/>
+            <w:tcMar>
+              <w:top w:w="60" w:type="dxa"/>
+              <w:bottom w:w="60" w:type="dxa"/>
+              <w:left w:w="60" w:type="dxa"/>
+              <w:right w:w="60" w:type="dxa"/>
+            </w:tcMar>
+          </w:tcPr>
+          <w:p>
+            <w:r>
+              <w:rPr>
+                <w:rFonts w:ascii="Times New Roman" w:hAnsi="Times New Roman"/>
+                <w:sz w:val="26"/>
+              </w:rPr>
+              <w:t>/api/resources</w:t>
+            </w:r>
+          </w:p>
+        </w:tc>
+        <w:tc>
+          <w:tcPr>
+            <w:tcW w:type="dxa" w:w="1728"/>
+            <w:shd w:fill="F9EBEA"/>
+            <w:tcMar>
+              <w:top w:w="60" w:type="dxa"/>
+              <w:bottom w:w="60" w:type="dxa"/>
+              <w:left w:w="60" w:type="dxa"/>
+              <w:right w:w="60" w:type="dxa"/>
+            </w:tcMar>
+          </w:tcPr>
+          <w:p>
+            <w:r>
+              <w:rPr>
+                <w:rFonts w:ascii="Times New Roman" w:hAnsi="Times New Roman"/>
+                <w:sz w:val="26"/>
+              </w:rPr>
+              <w:t>Admin</w:t>
+            </w:r>
+          </w:p>
+        </w:tc>
+        <w:tc>
+          <w:tcPr>
+            <w:tcW w:type="dxa" w:w="2880"/>
+            <w:shd w:fill="F9EBEA"/>
+            <w:tcMar>
+              <w:top w:w="60" w:type="dxa"/>
+              <w:bottom w:w="60" w:type="dxa"/>
+              <w:left w:w="60" w:type="dxa"/>
+              <w:right w:w="60" w:type="dxa"/>
+            </w:tcMar>
+          </w:tcPr>
+          <w:p>
+            <w:r>
+              <w:rPr>
+                <w:rFonts w:ascii="Times New Roman" w:hAnsi="Times New Roman"/>
+                <w:sz w:val="26"/>
+              </w:rPr>
+              <w:t>Admin tải tài liệu mới lên kho lưu trữ</w:t>
+            </w:r>
+          </w:p>
+        </w:tc>
+      </w:tr>
+      <w:tr>
+        <w:tc>
+          <w:tcPr>
+            <w:tcW w:type="dxa" w:w="1584"/>
+            <w:shd w:fill="F4F6F7"/>
+            <w:tcMar>
+              <w:top w:w="60" w:type="dxa"/>
+              <w:bottom w:w="60" w:type="dxa"/>
+              <w:left w:w="60" w:type="dxa"/>
+              <w:right w:w="60" w:type="dxa"/>
+            </w:tcMar>
+          </w:tcPr>
+          <w:p>
+            <w:r>
+              <w:rPr>
+                <w:rFonts w:ascii="Times New Roman" w:hAnsi="Times New Roman"/>
+                <w:b/>
+                <w:sz w:val="26"/>
+              </w:rPr>
+              <w:t>PUT</w:t>
+            </w:r>
+          </w:p>
+        </w:tc>
+        <w:tc>
+          <w:tcPr>
+            <w:tcW w:type="dxa" w:w="3600"/>
+            <w:shd w:fill="F4F6F7"/>
+            <w:tcMar>
+              <w:top w:w="60" w:type="dxa"/>
+              <w:bottom w:w="60" w:type="dxa"/>
+              <w:left w:w="60" w:type="dxa"/>
+              <w:right w:w="60" w:type="dxa"/>
+            </w:tcMar>
+          </w:tcPr>
+          <w:p>
+            <w:r>
+              <w:rPr>
+                <w:rFonts w:ascii="Times New Roman" w:hAnsi="Times New Roman"/>
+                <w:sz w:val="26"/>
+              </w:rPr>
+              <w:t>/api/resources/:id</w:t>
+            </w:r>
+          </w:p>
+        </w:tc>
+        <w:tc>
+          <w:tcPr>
+            <w:tcW w:type="dxa" w:w="1728"/>
+            <w:shd w:fill="F4F6F7"/>
+            <w:tcMar>
+              <w:top w:w="60" w:type="dxa"/>
+              <w:bottom w:w="60" w:type="dxa"/>
+              <w:left w:w="60" w:type="dxa"/>
+              <w:right w:w="60" w:type="dxa"/>
+            </w:tcMar>
+          </w:tcPr>
+          <w:p>
+            <w:r>
+              <w:rPr>
+                <w:rFonts w:ascii="Times New Roman" w:hAnsi="Times New Roman"/>
+                <w:sz w:val="26"/>
+              </w:rPr>
+              <w:t>Admin</w:t>
+            </w:r>
+          </w:p>
+        </w:tc>
+        <w:tc>
+          <w:tcPr>
+            <w:tcW w:type="dxa" w:w="2880"/>
+            <w:shd w:fill="F4F6F7"/>
+            <w:tcMar>
+              <w:top w:w="60" w:type="dxa"/>
+              <w:bottom w:w="60" w:type="dxa"/>
+              <w:left w:w="60" w:type="dxa"/>
+              <w:right w:w="60" w:type="dxa"/>
+            </w:tcMar>
+          </w:tcPr>
+          <w:p>
+            <w:r>
+              <w:rPr>
+                <w:rFonts w:ascii="Times New Roman" w:hAnsi="Times New Roman"/>
+                <w:sz w:val="26"/>
+              </w:rPr>
+              <w:t>Admin cập nhật thông tin tài liệu</w:t>
+            </w:r>
+          </w:p>
+        </w:tc>
+      </w:tr>
+      <w:tr>
+        <w:tc>
+          <w:tcPr>
+            <w:tcW w:type="dxa" w:w="1584"/>
+            <w:shd w:fill="F9EBEA"/>
+            <w:tcMar>
+              <w:top w:w="60" w:type="dxa"/>
+              <w:bottom w:w="60" w:type="dxa"/>
+              <w:left w:w="60" w:type="dxa"/>
+              <w:right w:w="60" w:type="dxa"/>
+            </w:tcMar>
+          </w:tcPr>
+          <w:p>
+            <w:r>
+              <w:rPr>
+                <w:rFonts w:ascii="Times New Roman" w:hAnsi="Times New Roman"/>
+                <w:b/>
+                <w:sz w:val="26"/>
+              </w:rPr>
+              <w:t>DELETE</w:t>
+            </w:r>
+          </w:p>
+        </w:tc>
+        <w:tc>
+          <w:tcPr>
+            <w:tcW w:type="dxa" w:w="3600"/>
+            <w:shd w:fill="F9EBEA"/>
+            <w:tcMar>
+              <w:top w:w="60" w:type="dxa"/>
+              <w:bottom w:w="60" w:type="dxa"/>
+              <w:left w:w="60" w:type="dxa"/>
+              <w:right w:w="60" w:type="dxa"/>
+            </w:tcMar>
+          </w:tcPr>
+          <w:p>
+            <w:r>
+              <w:rPr>
+                <w:rFonts w:ascii="Times New Roman" w:hAnsi="Times New Roman"/>
+                <w:sz w:val="26"/>
+              </w:rPr>
+              <w:t>/api/resources/:id</w:t>
+            </w:r>
+          </w:p>
+        </w:tc>
+        <w:tc>
+          <w:tcPr>
+            <w:tcW w:type="dxa" w:w="1728"/>
+            <w:shd w:fill="F9EBEA"/>
+            <w:tcMar>
+              <w:top w:w="60" w:type="dxa"/>
+              <w:bottom w:w="60" w:type="dxa"/>
+              <w:left w:w="60" w:type="dxa"/>
+              <w:right w:w="60" w:type="dxa"/>
+            </w:tcMar>
+          </w:tcPr>
+          <w:p>
+            <w:r>
+              <w:rPr>
+                <w:rFonts w:ascii="Times New Roman" w:hAnsi="Times New Roman"/>
+                <w:sz w:val="26"/>
+              </w:rPr>
+              <w:t>Admin</w:t>
+            </w:r>
+          </w:p>
+        </w:tc>
+        <w:tc>
+          <w:tcPr>
+            <w:tcW w:type="dxa" w:w="2880"/>
+            <w:shd w:fill="F9EBEA"/>
+            <w:tcMar>
+              <w:top w:w="60" w:type="dxa"/>
+              <w:bottom w:w="60" w:type="dxa"/>
+              <w:left w:w="60" w:type="dxa"/>
+              <w:right w:w="60" w:type="dxa"/>
+            </w:tcMar>
+          </w:tcPr>
+          <w:p>
+            <w:r>
+              <w:rPr>
+                <w:rFonts w:ascii="Times New Roman" w:hAnsi="Times New Roman"/>
+                <w:sz w:val="26"/>
+              </w:rPr>
+              <w:t>Admin xóa tài liệu khỏi kho</w:t>
+            </w:r>
+          </w:p>
+        </w:tc>
+      </w:tr>
+      <w:tr>
+        <w:tc>
+          <w:tcPr>
+            <w:tcW w:type="dxa" w:w="1584"/>
+            <w:shd w:fill="F4F6F7"/>
+            <w:tcMar>
+              <w:top w:w="60" w:type="dxa"/>
+              <w:bottom w:w="60" w:type="dxa"/>
+              <w:left w:w="60" w:type="dxa"/>
+              <w:right w:w="60" w:type="dxa"/>
+            </w:tcMar>
+          </w:tcPr>
+          <w:p>
+            <w:r>
+              <w:rPr>
+                <w:rFonts w:ascii="Times New Roman" w:hAnsi="Times New Roman"/>
+                <w:b/>
+                <w:sz w:val="26"/>
+              </w:rPr>
+              <w:t>POST</w:t>
+            </w:r>
+          </w:p>
+        </w:tc>
+        <w:tc>
+          <w:tcPr>
+            <w:tcW w:type="dxa" w:w="3600"/>
+            <w:shd w:fill="F4F6F7"/>
+            <w:tcMar>
+              <w:top w:w="60" w:type="dxa"/>
+              <w:bottom w:w="60" w:type="dxa"/>
+              <w:left w:w="60" w:type="dxa"/>
+              <w:right w:w="60" w:type="dxa"/>
+            </w:tcMar>
+          </w:tcPr>
+          <w:p>
+            <w:r>
+              <w:rPr>
+                <w:rFonts w:ascii="Times New Roman" w:hAnsi="Times New Roman"/>
+                <w:sz w:val="26"/>
+              </w:rPr>
+              <w:t>/api/resources/:id/send</w:t>
+            </w:r>
+          </w:p>
+        </w:tc>
+        <w:tc>
+          <w:tcPr>
+            <w:tcW w:type="dxa" w:w="1728"/>
+            <w:shd w:fill="F4F6F7"/>
+            <w:tcMar>
+              <w:top w:w="60" w:type="dxa"/>
+              <w:bottom w:w="60" w:type="dxa"/>
+              <w:left w:w="60" w:type="dxa"/>
+              <w:right w:w="60" w:type="dxa"/>
+            </w:tcMar>
+          </w:tcPr>
+          <w:p>
+            <w:r>
+              <w:rPr>
+                <w:rFonts w:ascii="Times New Roman" w:hAnsi="Times New Roman"/>
+                <w:sz w:val="26"/>
+              </w:rPr>
+              <w:t>Admin</w:t>
+            </w:r>
+          </w:p>
+        </w:tc>
+        <w:tc>
+          <w:tcPr>
+            <w:tcW w:type="dxa" w:w="2880"/>
+            <w:shd w:fill="F4F6F7"/>
+            <w:tcMar>
+              <w:top w:w="60" w:type="dxa"/>
+              <w:bottom w:w="60" w:type="dxa"/>
+              <w:left w:w="60" w:type="dxa"/>
+              <w:right w:w="60" w:type="dxa"/>
+            </w:tcMar>
+          </w:tcPr>
+          <w:p>
+            <w:r>
+              <w:rPr>
+                <w:rFonts w:ascii="Times New Roman" w:hAnsi="Times New Roman"/>
+                <w:sz w:val="26"/>
+              </w:rPr>
+              <w:t>Admin phát tài liệu từ kho tới học viên</w:t>
+            </w:r>
+          </w:p>
+        </w:tc>
+      </w:tr>
+    </w:tbl>
+    <w:p/>
+    <w:p>
+      <w:pPr>
+        <w:pStyle w:val="Heading1"/>
+        <w:spacing w:before="280" w:after="80"/>
+      </w:pPr>
+      <w:r>
+        <w:rPr>
+          <w:rFonts w:ascii="Times New Roman" w:hAnsi="Times New Roman"/>
+          <w:b/>
+          <w:color w:val="1B4F72"/>
+          <w:sz w:val="30"/>
+        </w:rPr>
+        <w:t>4. DANH SÁCH NGUỒN THAM KHẢO VÀ CHUẨN ĐÁNH GIÁ CHÍNH (MAIN REFERENCES)</w:t>
       </w:r>
     </w:p>
     <w:tbl>

</xml_diff>

<commit_message>
Update DANH_SACH_CONG_CU_MO_HINH_API_NGUON_THAM_KHAO.docx: ensure Section 4 references table is completely generated
</commit_message>
<xml_diff>
--- a/DANH_SACH_CONG_CU_MO_HINH_API_NGUON_THAM_KHAO.docx
+++ b/DANH_SACH_CONG_CU_MO_HINH_API_NGUON_THAM_KHAO.docx
@@ -4527,6 +4527,14 @@
         <w:t>4. DANH SÁCH NGUỒN THAM KHẢO VÀ CHUẨN ĐÁNH GIÁ CHÍNH (MAIN REFERENCES)</w:t>
       </w:r>
     </w:p>
+    <w:p>
+      <w:pPr>
+        <w:jc w:val="left"/>
+      </w:pPr>
+      <w:r>
+        <w:t>Dưới đây là các tài liệu chuẩn, tài liệu học thuật và tài liệu kỹ thuật chính được tham chiếu trong suốt quá trình nghiên cứu và phát triển dự án English Adaptive LMS:</w:t>
+      </w:r>
+    </w:p>
     <w:tbl>
       <w:tblPr>
         <w:tblW w:type="auto" w:w="0"/>

</xml_diff>

<commit_message>
Docs: polish all official Word document files with Times New Roman 13pt font, left alignment, professional tables and 100% clean formatting without emojis
</commit_message>
<xml_diff>
--- a/DANH_SACH_CONG_CU_MO_HINH_API_NGUON_THAM_KHAO.docx
+++ b/DANH_SACH_CONG_CU_MO_HINH_API_NGUON_THAM_KHAO.docx
@@ -4527,14 +4527,6 @@
         <w:t>4. DANH SÁCH NGUỒN THAM KHẢO VÀ CHUẨN ĐÁNH GIÁ CHÍNH (MAIN REFERENCES)</w:t>
       </w:r>
     </w:p>
-    <w:p>
-      <w:pPr>
-        <w:jc w:val="left"/>
-      </w:pPr>
-      <w:r>
-        <w:t>Dưới đây là các tài liệu chuẩn, tài liệu học thuật và tài liệu kỹ thuật chính được tham chiếu trong suốt quá trình nghiên cứu và phát triển dự án English Adaptive LMS:</w:t>
-      </w:r>
-    </w:p>
     <w:tbl>
       <w:tblPr>
         <w:tblW w:type="auto" w:w="0"/>

</xml_diff>